<commit_message>
feat: finalize PowerInsight course delivery
</commit_message>
<xml_diff>
--- a/docs/课程提交报告/《电力人工智能综合实训》小组项目报告-最终版.docx
+++ b/docs/课程提交报告/《电力人工智能综合实训》小组项目报告-最终版.docx
@@ -131,7 +131,7 @@
           <w:b/>
           <w:sz w:val="28"/>
         </w:rPr>
-        <w:t>学号：【请填写组长姓名】</w:t>
+        <w:t>学号：小组组长</w:t>
       </w:r>
       <w:r>
         <w:rPr>
@@ -147,7 +147,7 @@
           <w:b/>
           <w:sz w:val="28"/>
         </w:rPr>
-        <w:t>【请填写组长学号】</w:t>
+        <w:t>【请填写学号】</w:t>
       </w:r>
     </w:p>
     <w:p>
@@ -164,7 +164,15 @@
           <w:b/>
           <w:sz w:val="28"/>
         </w:rPr>
-        <w:t>队伍名称：【请填写队伍名称】</w:t>
+        <w:t>队伍名称：小组</w:t>
+      </w:r>
+      <w:r>
+        <w:rPr>
+          <w:rFonts w:ascii="Times New Roman" w:hAnsi="Times New Roman"/>
+          <w:b/>
+          <w:sz w:val="28"/>
+        </w:rPr>
+        <w:t>xx</w:t>
       </w:r>
     </w:p>
     <w:p>
@@ -214,7 +222,7 @@
           <w:b/>
           <w:sz w:val="28"/>
         </w:rPr>
-        <w:t>学号：【请填写成员一姓名】</w:t>
+        <w:t>学号：小组成员</w:t>
       </w:r>
       <w:r>
         <w:rPr>
@@ -222,7 +230,7 @@
           <w:b/>
           <w:sz w:val="28"/>
         </w:rPr>
-        <w:t xml:space="preserve"> / </w:t>
+        <w:t xml:space="preserve">1 / </w:t>
       </w:r>
       <w:r>
         <w:rPr>
@@ -230,7 +238,7 @@
           <w:b/>
           <w:sz w:val="28"/>
         </w:rPr>
-        <w:t>【请填写成员一学号】</w:t>
+        <w:t>【请填写学号】</w:t>
       </w:r>
     </w:p>
     <w:p>
@@ -263,7 +271,7 @@
           <w:b/>
           <w:sz w:val="28"/>
         </w:rPr>
-        <w:t>学号：【请填写成员二姓名】</w:t>
+        <w:t>学号：小组成员</w:t>
       </w:r>
       <w:r>
         <w:rPr>
@@ -271,7 +279,7 @@
           <w:b/>
           <w:sz w:val="28"/>
         </w:rPr>
-        <w:t xml:space="preserve"> / </w:t>
+        <w:t xml:space="preserve">2 / </w:t>
       </w:r>
       <w:r>
         <w:rPr>
@@ -279,7 +287,7 @@
           <w:b/>
           <w:sz w:val="28"/>
         </w:rPr>
-        <w:t>【请填写成员二学号】</w:t>
+        <w:t>【请填写学号】</w:t>
       </w:r>
     </w:p>
     <w:p>
@@ -312,7 +320,7 @@
           <w:b/>
           <w:sz w:val="28"/>
         </w:rPr>
-        <w:t>学号：【请填写成员三姓名】</w:t>
+        <w:t>学号：小组成员</w:t>
       </w:r>
       <w:r>
         <w:rPr>
@@ -320,7 +328,7 @@
           <w:b/>
           <w:sz w:val="28"/>
         </w:rPr>
-        <w:t xml:space="preserve"> / </w:t>
+        <w:t xml:space="preserve">4 / </w:t>
       </w:r>
       <w:r>
         <w:rPr>
@@ -328,7 +336,7 @@
           <w:b/>
           <w:sz w:val="28"/>
         </w:rPr>
-        <w:t>【请填写成员三学号】</w:t>
+        <w:t>【请填写学号】</w:t>
       </w:r>
     </w:p>
     <w:p>
@@ -354,12 +362,6 @@
           <w:rFonts w:hint="eastAsia"/>
         </w:rPr>
         <w:sectPr>
-          <w:headerReference w:type="even" r:id="rId8"/>
-          <w:headerReference w:type="default" r:id="rId9"/>
-          <w:footerReference w:type="even" r:id="rId10"/>
-          <w:footerReference w:type="default" r:id="rId11"/>
-          <w:headerReference w:type="first" r:id="rId12"/>
-          <w:footerReference w:type="first" r:id="rId13"/>
           <w:pgSz w:w="11906" w:h="16838"/>
           <w:pgMar w:top="1440" w:right="1800" w:bottom="1440" w:left="1800" w:header="851" w:footer="992" w:gutter="0"/>
           <w:cols w:space="720"/>
@@ -491,7 +493,7 @@
           <w:rFonts w:hint="eastAsia"/>
         </w:rPr>
         <w:sectPr>
-          <w:footerReference w:type="default" r:id="rId14"/>
+          <w:footerReference w:type="default" r:id="rId8"/>
           <w:pgSz w:w="11906" w:h="16838"/>
           <w:pgMar w:top="1440" w:right="1800" w:bottom="1440" w:left="1800" w:header="851" w:footer="992" w:gutter="0"/>
           <w:cols w:space="720"/>
@@ -558,7 +560,7 @@
       <w:r>
         <w:fldChar w:fldCharType="separate"/>
       </w:r>
-      <w:hyperlink w:anchor="_Toc235559126" w:history="1">
+      <w:hyperlink w:anchor="_Toc235620388" w:history="1">
         <w:r>
           <w:rPr>
             <w:rStyle w:val="aff9"/>
@@ -596,7 +598,7 @@
             <w:noProof/>
             <w:webHidden/>
           </w:rPr>
-          <w:instrText>PAGEREF _Toc235559126 \h</w:instrText>
+          <w:instrText>PAGEREF _Toc235620388 \h</w:instrText>
         </w:r>
         <w:r>
           <w:rPr>
@@ -655,7 +657,7 @@
           <w14:ligatures w14:val="standardContextual"/>
         </w:rPr>
       </w:pPr>
-      <w:hyperlink w:anchor="_Toc235559127" w:history="1">
+      <w:hyperlink w:anchor="_Toc235620389" w:history="1">
         <w:r>
           <w:rPr>
             <w:rStyle w:val="aff9"/>
@@ -701,7 +703,7 @@
             <w:noProof/>
             <w:webHidden/>
           </w:rPr>
-          <w:instrText>PAGEREF _Toc235559127 \h</w:instrText>
+          <w:instrText>PAGEREF _Toc235620389 \h</w:instrText>
         </w:r>
         <w:r>
           <w:rPr>
@@ -761,7 +763,7 @@
           <w14:ligatures w14:val="standardContextual"/>
         </w:rPr>
       </w:pPr>
-      <w:hyperlink w:anchor="_Toc235559128" w:history="1">
+      <w:hyperlink w:anchor="_Toc235620390" w:history="1">
         <w:r>
           <w:rPr>
             <w:rStyle w:val="aff9"/>
@@ -807,7 +809,7 @@
             <w:noProof/>
             <w:webHidden/>
           </w:rPr>
-          <w:instrText>PAGEREF _Toc235559128 \h</w:instrText>
+          <w:instrText>PAGEREF _Toc235620390 \h</w:instrText>
         </w:r>
         <w:r>
           <w:rPr>
@@ -867,7 +869,7 @@
           <w14:ligatures w14:val="standardContextual"/>
         </w:rPr>
       </w:pPr>
-      <w:hyperlink w:anchor="_Toc235559129" w:history="1">
+      <w:hyperlink w:anchor="_Toc235620391" w:history="1">
         <w:r>
           <w:rPr>
             <w:rStyle w:val="aff9"/>
@@ -913,7 +915,7 @@
             <w:noProof/>
             <w:webHidden/>
           </w:rPr>
-          <w:instrText>PAGEREF _Toc235559129 \h</w:instrText>
+          <w:instrText>PAGEREF _Toc235620391 \h</w:instrText>
         </w:r>
         <w:r>
           <w:rPr>
@@ -973,7 +975,7 @@
           <w14:ligatures w14:val="standardContextual"/>
         </w:rPr>
       </w:pPr>
-      <w:hyperlink w:anchor="_Toc235559130" w:history="1">
+      <w:hyperlink w:anchor="_Toc235620392" w:history="1">
         <w:r>
           <w:rPr>
             <w:rStyle w:val="aff9"/>
@@ -1019,7 +1021,7 @@
             <w:noProof/>
             <w:webHidden/>
           </w:rPr>
-          <w:instrText>PAGEREF _Toc235559130 \h</w:instrText>
+          <w:instrText>PAGEREF _Toc235620392 \h</w:instrText>
         </w:r>
         <w:r>
           <w:rPr>
@@ -1078,7 +1080,7 @@
           <w14:ligatures w14:val="standardContextual"/>
         </w:rPr>
       </w:pPr>
-      <w:hyperlink w:anchor="_Toc235559131" w:history="1">
+      <w:hyperlink w:anchor="_Toc235620393" w:history="1">
         <w:r>
           <w:rPr>
             <w:rStyle w:val="aff9"/>
@@ -1124,7 +1126,7 @@
             <w:noProof/>
             <w:webHidden/>
           </w:rPr>
-          <w:instrText>PAGEREF _Toc235559131 \h</w:instrText>
+          <w:instrText>PAGEREF _Toc235620393 \h</w:instrText>
         </w:r>
         <w:r>
           <w:rPr>
@@ -1184,7 +1186,7 @@
           <w14:ligatures w14:val="standardContextual"/>
         </w:rPr>
       </w:pPr>
-      <w:hyperlink w:anchor="_Toc235559132" w:history="1">
+      <w:hyperlink w:anchor="_Toc235620394" w:history="1">
         <w:r>
           <w:rPr>
             <w:rStyle w:val="aff9"/>
@@ -1230,7 +1232,7 @@
             <w:noProof/>
             <w:webHidden/>
           </w:rPr>
-          <w:instrText>PAGEREF _Toc235559132 \h</w:instrText>
+          <w:instrText>PAGEREF _Toc235620394 \h</w:instrText>
         </w:r>
         <w:r>
           <w:rPr>
@@ -1290,7 +1292,7 @@
           <w14:ligatures w14:val="standardContextual"/>
         </w:rPr>
       </w:pPr>
-      <w:hyperlink w:anchor="_Toc235559133" w:history="1">
+      <w:hyperlink w:anchor="_Toc235620395" w:history="1">
         <w:r>
           <w:rPr>
             <w:rStyle w:val="aff9"/>
@@ -1336,7 +1338,7 @@
             <w:noProof/>
             <w:webHidden/>
           </w:rPr>
-          <w:instrText>PAGEREF _Toc235559133 \h</w:instrText>
+          <w:instrText>PAGEREF _Toc235620395 \h</w:instrText>
         </w:r>
         <w:r>
           <w:rPr>
@@ -1396,7 +1398,7 @@
           <w14:ligatures w14:val="standardContextual"/>
         </w:rPr>
       </w:pPr>
-      <w:hyperlink w:anchor="_Toc235559134" w:history="1">
+      <w:hyperlink w:anchor="_Toc235620396" w:history="1">
         <w:r>
           <w:rPr>
             <w:rStyle w:val="aff9"/>
@@ -1442,7 +1444,7 @@
             <w:noProof/>
             <w:webHidden/>
           </w:rPr>
-          <w:instrText>PAGEREF _Toc235559134 \h</w:instrText>
+          <w:instrText>PAGEREF _Toc235620396 \h</w:instrText>
         </w:r>
         <w:r>
           <w:rPr>
@@ -1502,7 +1504,7 @@
           <w14:ligatures w14:val="standardContextual"/>
         </w:rPr>
       </w:pPr>
-      <w:hyperlink w:anchor="_Toc235559135" w:history="1">
+      <w:hyperlink w:anchor="_Toc235620397" w:history="1">
         <w:r>
           <w:rPr>
             <w:rStyle w:val="aff9"/>
@@ -1548,7 +1550,7 @@
             <w:noProof/>
             <w:webHidden/>
           </w:rPr>
-          <w:instrText>PAGEREF _Toc235559135 \h</w:instrText>
+          <w:instrText>PAGEREF _Toc235620397 \h</w:instrText>
         </w:r>
         <w:r>
           <w:rPr>
@@ -1607,7 +1609,7 @@
           <w14:ligatures w14:val="standardContextual"/>
         </w:rPr>
       </w:pPr>
-      <w:hyperlink w:anchor="_Toc235559136" w:history="1">
+      <w:hyperlink w:anchor="_Toc235620398" w:history="1">
         <w:r>
           <w:rPr>
             <w:rStyle w:val="aff9"/>
@@ -1653,7 +1655,7 @@
             <w:noProof/>
             <w:webHidden/>
           </w:rPr>
-          <w:instrText>PAGEREF _Toc235559136 \h</w:instrText>
+          <w:instrText>PAGEREF _Toc235620398 \h</w:instrText>
         </w:r>
         <w:r>
           <w:rPr>
@@ -1713,7 +1715,7 @@
           <w14:ligatures w14:val="standardContextual"/>
         </w:rPr>
       </w:pPr>
-      <w:hyperlink w:anchor="_Toc235559137" w:history="1">
+      <w:hyperlink w:anchor="_Toc235620399" w:history="1">
         <w:r>
           <w:rPr>
             <w:rStyle w:val="aff9"/>
@@ -1759,7 +1761,7 @@
             <w:noProof/>
             <w:webHidden/>
           </w:rPr>
-          <w:instrText>PAGEREF _Toc235559137 \h</w:instrText>
+          <w:instrText>PAGEREF _Toc235620399 \h</w:instrText>
         </w:r>
         <w:r>
           <w:rPr>
@@ -1819,7 +1821,7 @@
           <w14:ligatures w14:val="standardContextual"/>
         </w:rPr>
       </w:pPr>
-      <w:hyperlink w:anchor="_Toc235559138" w:history="1">
+      <w:hyperlink w:anchor="_Toc235620400" w:history="1">
         <w:r>
           <w:rPr>
             <w:rStyle w:val="aff9"/>
@@ -1865,7 +1867,7 @@
             <w:noProof/>
             <w:webHidden/>
           </w:rPr>
-          <w:instrText>PAGEREF _Toc235559138 \h</w:instrText>
+          <w:instrText>PAGEREF _Toc235620400 \h</w:instrText>
         </w:r>
         <w:r>
           <w:rPr>
@@ -1925,7 +1927,7 @@
           <w14:ligatures w14:val="standardContextual"/>
         </w:rPr>
       </w:pPr>
-      <w:hyperlink w:anchor="_Toc235559139" w:history="1">
+      <w:hyperlink w:anchor="_Toc235620401" w:history="1">
         <w:r>
           <w:rPr>
             <w:rStyle w:val="aff9"/>
@@ -1971,7 +1973,7 @@
             <w:noProof/>
             <w:webHidden/>
           </w:rPr>
-          <w:instrText>PAGEREF _Toc235559139 \h</w:instrText>
+          <w:instrText>PAGEREF _Toc235620401 \h</w:instrText>
         </w:r>
         <w:r>
           <w:rPr>
@@ -2031,7 +2033,7 @@
           <w14:ligatures w14:val="standardContextual"/>
         </w:rPr>
       </w:pPr>
-      <w:hyperlink w:anchor="_Toc235559140" w:history="1">
+      <w:hyperlink w:anchor="_Toc235620402" w:history="1">
         <w:r>
           <w:rPr>
             <w:rStyle w:val="aff9"/>
@@ -2077,7 +2079,7 @@
             <w:noProof/>
             <w:webHidden/>
           </w:rPr>
-          <w:instrText>PAGEREF _Toc235559140 \h</w:instrText>
+          <w:instrText>PAGEREF _Toc235620402 \h</w:instrText>
         </w:r>
         <w:r>
           <w:rPr>
@@ -2137,7 +2139,7 @@
           <w14:ligatures w14:val="standardContextual"/>
         </w:rPr>
       </w:pPr>
-      <w:hyperlink w:anchor="_Toc235559141" w:history="1">
+      <w:hyperlink w:anchor="_Toc235620403" w:history="1">
         <w:r>
           <w:rPr>
             <w:rStyle w:val="aff9"/>
@@ -2183,7 +2185,7 @@
             <w:noProof/>
             <w:webHidden/>
           </w:rPr>
-          <w:instrText>PAGEREF _Toc235559141 \h</w:instrText>
+          <w:instrText>PAGEREF _Toc235620403 \h</w:instrText>
         </w:r>
         <w:r>
           <w:rPr>
@@ -2214,7 +2216,7 @@
             <w:noProof/>
             <w:webHidden/>
           </w:rPr>
-          <w:t>3</w:t>
+          <w:t>4</w:t>
         </w:r>
         <w:r>
           <w:rPr>
@@ -2243,7 +2245,7 @@
           <w14:ligatures w14:val="standardContextual"/>
         </w:rPr>
       </w:pPr>
-      <w:hyperlink w:anchor="_Toc235559142" w:history="1">
+      <w:hyperlink w:anchor="_Toc235620404" w:history="1">
         <w:r>
           <w:rPr>
             <w:rStyle w:val="aff9"/>
@@ -2289,7 +2291,7 @@
             <w:noProof/>
             <w:webHidden/>
           </w:rPr>
-          <w:instrText>PAGEREF _Toc235559142 \h</w:instrText>
+          <w:instrText>PAGEREF _Toc235620404 \h</w:instrText>
         </w:r>
         <w:r>
           <w:rPr>
@@ -2348,7 +2350,7 @@
           <w14:ligatures w14:val="standardContextual"/>
         </w:rPr>
       </w:pPr>
-      <w:hyperlink w:anchor="_Toc235559143" w:history="1">
+      <w:hyperlink w:anchor="_Toc235620405" w:history="1">
         <w:r>
           <w:rPr>
             <w:rStyle w:val="aff9"/>
@@ -2394,7 +2396,7 @@
             <w:noProof/>
             <w:webHidden/>
           </w:rPr>
-          <w:instrText>PAGEREF _Toc235559143 \h</w:instrText>
+          <w:instrText>PAGEREF _Toc235620405 \h</w:instrText>
         </w:r>
         <w:r>
           <w:rPr>
@@ -2425,7 +2427,7 @@
             <w:noProof/>
             <w:webHidden/>
           </w:rPr>
-          <w:t>7</w:t>
+          <w:t>8</w:t>
         </w:r>
         <w:r>
           <w:rPr>
@@ -2454,7 +2456,7 @@
           <w14:ligatures w14:val="standardContextual"/>
         </w:rPr>
       </w:pPr>
-      <w:hyperlink w:anchor="_Toc235559144" w:history="1">
+      <w:hyperlink w:anchor="_Toc235620406" w:history="1">
         <w:r>
           <w:rPr>
             <w:rStyle w:val="aff9"/>
@@ -2508,7 +2510,7 @@
             <w:noProof/>
             <w:webHidden/>
           </w:rPr>
-          <w:instrText>PAGEREF _Toc235559144 \h</w:instrText>
+          <w:instrText>PAGEREF _Toc235620406 \h</w:instrText>
         </w:r>
         <w:r>
           <w:rPr>
@@ -2539,7 +2541,7 @@
             <w:noProof/>
             <w:webHidden/>
           </w:rPr>
-          <w:t>7</w:t>
+          <w:t>8</w:t>
         </w:r>
         <w:r>
           <w:rPr>
@@ -2568,7 +2570,7 @@
           <w14:ligatures w14:val="standardContextual"/>
         </w:rPr>
       </w:pPr>
-      <w:hyperlink w:anchor="_Toc235559145" w:history="1">
+      <w:hyperlink w:anchor="_Toc235620407" w:history="1">
         <w:r>
           <w:rPr>
             <w:rStyle w:val="aff9"/>
@@ -2614,7 +2616,7 @@
             <w:noProof/>
             <w:webHidden/>
           </w:rPr>
-          <w:instrText>PAGEREF _Toc235559145 \h</w:instrText>
+          <w:instrText>PAGEREF _Toc235620407 \h</w:instrText>
         </w:r>
         <w:r>
           <w:rPr>
@@ -2645,7 +2647,7 @@
             <w:noProof/>
             <w:webHidden/>
           </w:rPr>
-          <w:t>8</w:t>
+          <w:t>9</w:t>
         </w:r>
         <w:r>
           <w:rPr>
@@ -2674,7 +2676,7 @@
           <w14:ligatures w14:val="standardContextual"/>
         </w:rPr>
       </w:pPr>
-      <w:hyperlink w:anchor="_Toc235559146" w:history="1">
+      <w:hyperlink w:anchor="_Toc235620408" w:history="1">
         <w:r>
           <w:rPr>
             <w:rStyle w:val="aff9"/>
@@ -2720,7 +2722,7 @@
             <w:noProof/>
             <w:webHidden/>
           </w:rPr>
-          <w:instrText>PAGEREF _Toc235559146 \h</w:instrText>
+          <w:instrText>PAGEREF _Toc235620408 \h</w:instrText>
         </w:r>
         <w:r>
           <w:rPr>
@@ -2751,7 +2753,7 @@
             <w:noProof/>
             <w:webHidden/>
           </w:rPr>
-          <w:t>8</w:t>
+          <w:t>9</w:t>
         </w:r>
         <w:r>
           <w:rPr>
@@ -2780,7 +2782,7 @@
           <w14:ligatures w14:val="standardContextual"/>
         </w:rPr>
       </w:pPr>
-      <w:hyperlink w:anchor="_Toc235559147" w:history="1">
+      <w:hyperlink w:anchor="_Toc235620409" w:history="1">
         <w:r>
           <w:rPr>
             <w:rStyle w:val="aff9"/>
@@ -2826,7 +2828,7 @@
             <w:noProof/>
             <w:webHidden/>
           </w:rPr>
-          <w:instrText>PAGEREF _Toc235559147 \h</w:instrText>
+          <w:instrText>PAGEREF _Toc235620409 \h</w:instrText>
         </w:r>
         <w:r>
           <w:rPr>
@@ -2857,7 +2859,7 @@
             <w:noProof/>
             <w:webHidden/>
           </w:rPr>
-          <w:t>9</w:t>
+          <w:t>10</w:t>
         </w:r>
         <w:r>
           <w:rPr>
@@ -2886,7 +2888,7 @@
           <w14:ligatures w14:val="standardContextual"/>
         </w:rPr>
       </w:pPr>
-      <w:hyperlink w:anchor="_Toc235559148" w:history="1">
+      <w:hyperlink w:anchor="_Toc235620410" w:history="1">
         <w:r>
           <w:rPr>
             <w:rStyle w:val="aff9"/>
@@ -2932,7 +2934,7 @@
             <w:noProof/>
             <w:webHidden/>
           </w:rPr>
-          <w:instrText>PAGEREF _Toc235559148 \h</w:instrText>
+          <w:instrText>PAGEREF _Toc235620410 \h</w:instrText>
         </w:r>
         <w:r>
           <w:rPr>
@@ -2963,7 +2965,7 @@
             <w:noProof/>
             <w:webHidden/>
           </w:rPr>
-          <w:t>9</w:t>
+          <w:t>10</w:t>
         </w:r>
         <w:r>
           <w:rPr>
@@ -2991,7 +2993,7 @@
           <w14:ligatures w14:val="standardContextual"/>
         </w:rPr>
       </w:pPr>
-      <w:hyperlink w:anchor="_Toc235559149" w:history="1">
+      <w:hyperlink w:anchor="_Toc235620411" w:history="1">
         <w:r>
           <w:rPr>
             <w:rStyle w:val="aff9"/>
@@ -3037,7 +3039,7 @@
             <w:noProof/>
             <w:webHidden/>
           </w:rPr>
-          <w:instrText>PAGEREF _Toc235559149 \h</w:instrText>
+          <w:instrText>PAGEREF _Toc235620411 \h</w:instrText>
         </w:r>
         <w:r>
           <w:rPr>
@@ -3068,7 +3070,7 @@
             <w:noProof/>
             <w:webHidden/>
           </w:rPr>
-          <w:t>9</w:t>
+          <w:t>10</w:t>
         </w:r>
         <w:r>
           <w:rPr>
@@ -3097,7 +3099,7 @@
           <w14:ligatures w14:val="standardContextual"/>
         </w:rPr>
       </w:pPr>
-      <w:hyperlink w:anchor="_Toc235559150" w:history="1">
+      <w:hyperlink w:anchor="_Toc235620412" w:history="1">
         <w:r>
           <w:rPr>
             <w:rStyle w:val="aff9"/>
@@ -3143,7 +3145,7 @@
             <w:noProof/>
             <w:webHidden/>
           </w:rPr>
-          <w:instrText>PAGEREF _Toc235559150 \h</w:instrText>
+          <w:instrText>PAGEREF _Toc235620412 \h</w:instrText>
         </w:r>
         <w:r>
           <w:rPr>
@@ -3174,7 +3176,7 @@
             <w:noProof/>
             <w:webHidden/>
           </w:rPr>
-          <w:t>9</w:t>
+          <w:t>10</w:t>
         </w:r>
         <w:r>
           <w:rPr>
@@ -3203,7 +3205,7 @@
           <w14:ligatures w14:val="standardContextual"/>
         </w:rPr>
       </w:pPr>
-      <w:hyperlink w:anchor="_Toc235559151" w:history="1">
+      <w:hyperlink w:anchor="_Toc235620413" w:history="1">
         <w:r>
           <w:rPr>
             <w:rStyle w:val="aff9"/>
@@ -3249,7 +3251,7 @@
             <w:noProof/>
             <w:webHidden/>
           </w:rPr>
-          <w:instrText>PAGEREF _Toc235559151 \h</w:instrText>
+          <w:instrText>PAGEREF _Toc235620413 \h</w:instrText>
         </w:r>
         <w:r>
           <w:rPr>
@@ -3280,7 +3282,7 @@
             <w:noProof/>
             <w:webHidden/>
           </w:rPr>
-          <w:t>10</w:t>
+          <w:t>11</w:t>
         </w:r>
         <w:r>
           <w:rPr>
@@ -3309,7 +3311,7 @@
           <w14:ligatures w14:val="standardContextual"/>
         </w:rPr>
       </w:pPr>
-      <w:hyperlink w:anchor="_Toc235559152" w:history="1">
+      <w:hyperlink w:anchor="_Toc235620414" w:history="1">
         <w:r>
           <w:rPr>
             <w:rStyle w:val="aff9"/>
@@ -3355,7 +3357,7 @@
             <w:noProof/>
             <w:webHidden/>
           </w:rPr>
-          <w:instrText>PAGEREF _Toc235559152 \h</w:instrText>
+          <w:instrText>PAGEREF _Toc235620414 \h</w:instrText>
         </w:r>
         <w:r>
           <w:rPr>
@@ -3386,7 +3388,7 @@
             <w:noProof/>
             <w:webHidden/>
           </w:rPr>
-          <w:t>10</w:t>
+          <w:t>11</w:t>
         </w:r>
         <w:r>
           <w:rPr>
@@ -3415,7 +3417,7 @@
           <w14:ligatures w14:val="standardContextual"/>
         </w:rPr>
       </w:pPr>
-      <w:hyperlink w:anchor="_Toc235559153" w:history="1">
+      <w:hyperlink w:anchor="_Toc235620415" w:history="1">
         <w:r>
           <w:rPr>
             <w:rStyle w:val="aff9"/>
@@ -3461,7 +3463,7 @@
             <w:noProof/>
             <w:webHidden/>
           </w:rPr>
-          <w:instrText>PAGEREF _Toc235559153 \h</w:instrText>
+          <w:instrText>PAGEREF _Toc235620415 \h</w:instrText>
         </w:r>
         <w:r>
           <w:rPr>
@@ -3492,7 +3494,7 @@
             <w:noProof/>
             <w:webHidden/>
           </w:rPr>
-          <w:t>10</w:t>
+          <w:t>11</w:t>
         </w:r>
         <w:r>
           <w:rPr>
@@ -3520,7 +3522,7 @@
           <w14:ligatures w14:val="standardContextual"/>
         </w:rPr>
       </w:pPr>
-      <w:hyperlink w:anchor="_Toc235559154" w:history="1">
+      <w:hyperlink w:anchor="_Toc235620416" w:history="1">
         <w:r>
           <w:rPr>
             <w:rStyle w:val="aff9"/>
@@ -3566,7 +3568,7 @@
             <w:noProof/>
             <w:webHidden/>
           </w:rPr>
-          <w:instrText>PAGEREF _Toc235559154 \h</w:instrText>
+          <w:instrText>PAGEREF _Toc235620416 \h</w:instrText>
         </w:r>
         <w:r>
           <w:rPr>
@@ -3597,7 +3599,7 @@
             <w:noProof/>
             <w:webHidden/>
           </w:rPr>
-          <w:t>10</w:t>
+          <w:t>11</w:t>
         </w:r>
         <w:r>
           <w:rPr>
@@ -3625,7 +3627,7 @@
           <w14:ligatures w14:val="standardContextual"/>
         </w:rPr>
       </w:pPr>
-      <w:hyperlink w:anchor="_Toc235559155" w:history="1">
+      <w:hyperlink w:anchor="_Toc235620417" w:history="1">
         <w:r>
           <w:rPr>
             <w:rStyle w:val="aff9"/>
@@ -3671,7 +3673,7 @@
             <w:noProof/>
             <w:webHidden/>
           </w:rPr>
-          <w:instrText>PAGEREF _Toc235559155 \h</w:instrText>
+          <w:instrText>PAGEREF _Toc235620417 \h</w:instrText>
         </w:r>
         <w:r>
           <w:rPr>
@@ -3702,7 +3704,7 @@
             <w:noProof/>
             <w:webHidden/>
           </w:rPr>
-          <w:t>10</w:t>
+          <w:t>11</w:t>
         </w:r>
         <w:r>
           <w:rPr>
@@ -3730,7 +3732,7 @@
           <w14:ligatures w14:val="standardContextual"/>
         </w:rPr>
       </w:pPr>
-      <w:hyperlink w:anchor="_Toc235559156" w:history="1">
+      <w:hyperlink w:anchor="_Toc235620418" w:history="1">
         <w:r>
           <w:rPr>
             <w:rStyle w:val="aff9"/>
@@ -3776,7 +3778,7 @@
             <w:noProof/>
             <w:webHidden/>
           </w:rPr>
-          <w:instrText>PAGEREF _Toc235559156 \h</w:instrText>
+          <w:instrText>PAGEREF _Toc235620418 \h</w:instrText>
         </w:r>
         <w:r>
           <w:rPr>
@@ -3807,7 +3809,7 @@
             <w:noProof/>
             <w:webHidden/>
           </w:rPr>
-          <w:t>11</w:t>
+          <w:t>12</w:t>
         </w:r>
         <w:r>
           <w:rPr>
@@ -3836,7 +3838,7 @@
           <w14:ligatures w14:val="standardContextual"/>
         </w:rPr>
       </w:pPr>
-      <w:hyperlink w:anchor="_Toc235559157" w:history="1">
+      <w:hyperlink w:anchor="_Toc235620419" w:history="1">
         <w:r>
           <w:rPr>
             <w:rStyle w:val="aff9"/>
@@ -3882,7 +3884,7 @@
             <w:noProof/>
             <w:webHidden/>
           </w:rPr>
-          <w:instrText>PAGEREF _Toc235559157 \h</w:instrText>
+          <w:instrText>PAGEREF _Toc235620419 \h</w:instrText>
         </w:r>
         <w:r>
           <w:rPr>
@@ -3913,7 +3915,7 @@
             <w:noProof/>
             <w:webHidden/>
           </w:rPr>
-          <w:t>11</w:t>
+          <w:t>12</w:t>
         </w:r>
         <w:r>
           <w:rPr>
@@ -3942,7 +3944,7 @@
           <w14:ligatures w14:val="standardContextual"/>
         </w:rPr>
       </w:pPr>
-      <w:hyperlink w:anchor="_Toc235559158" w:history="1">
+      <w:hyperlink w:anchor="_Toc235620420" w:history="1">
         <w:r>
           <w:rPr>
             <w:rStyle w:val="aff9"/>
@@ -3988,7 +3990,7 @@
             <w:noProof/>
             <w:webHidden/>
           </w:rPr>
-          <w:instrText>PAGEREF _Toc235559158 \h</w:instrText>
+          <w:instrText>PAGEREF _Toc235620420 \h</w:instrText>
         </w:r>
         <w:r>
           <w:rPr>
@@ -4019,7 +4021,7 @@
             <w:noProof/>
             <w:webHidden/>
           </w:rPr>
-          <w:t>11</w:t>
+          <w:t>12</w:t>
         </w:r>
         <w:r>
           <w:rPr>
@@ -4048,7 +4050,7 @@
           <w14:ligatures w14:val="standardContextual"/>
         </w:rPr>
       </w:pPr>
-      <w:hyperlink w:anchor="_Toc235559159" w:history="1">
+      <w:hyperlink w:anchor="_Toc235620421" w:history="1">
         <w:r>
           <w:rPr>
             <w:rStyle w:val="aff9"/>
@@ -4094,7 +4096,7 @@
             <w:noProof/>
             <w:webHidden/>
           </w:rPr>
-          <w:instrText>PAGEREF _Toc235559159 \h</w:instrText>
+          <w:instrText>PAGEREF _Toc235620421 \h</w:instrText>
         </w:r>
         <w:r>
           <w:rPr>
@@ -4125,7 +4127,7 @@
             <w:noProof/>
             <w:webHidden/>
           </w:rPr>
-          <w:t>11</w:t>
+          <w:t>12</w:t>
         </w:r>
         <w:r>
           <w:rPr>
@@ -4153,7 +4155,7 @@
           <w:rFonts w:hint="eastAsia"/>
         </w:rPr>
         <w:sectPr>
-          <w:footerReference w:type="default" r:id="rId15"/>
+          <w:footerReference w:type="default" r:id="rId9"/>
           <w:pgSz w:w="11906" w:h="16838"/>
           <w:pgMar w:top="1440" w:right="1800" w:bottom="1440" w:left="1800" w:header="851" w:footer="992" w:gutter="0"/>
           <w:cols w:space="720"/>
@@ -4184,7 +4186,7 @@
         <w:pStyle w:val="1"/>
         <w:spacing w:before="240" w:after="120"/>
       </w:pPr>
-      <w:bookmarkStart w:id="0" w:name="_Toc235559126"/>
+      <w:bookmarkStart w:id="0" w:name="_Toc235620388"/>
       <w:r>
         <w:rPr>
           <w:rFonts w:ascii="Times New Roman" w:eastAsia="宋体" w:hAnsi="Times New Roman"/>
@@ -4195,244 +4197,15 @@
     </w:p>
     <w:p>
       <w:pPr>
+        <w:spacing w:after="80"/>
         <w:ind w:firstLine="480"/>
+        <w:jc w:val="both"/>
         <w:rPr>
           <w:rFonts w:hint="eastAsia"/>
         </w:rPr>
       </w:pPr>
       <w:r>
-        <w:rPr>
-          <w:rFonts w:ascii="Times New Roman" w:hAnsi="Times New Roman"/>
-        </w:rPr>
-        <w:t>本项目面向《电力人工智能综合实训》，以课程固定家庭用电</w:t>
-      </w:r>
-      <w:r>
-        <w:rPr>
-          <w:rFonts w:ascii="Times New Roman" w:hAnsi="Times New Roman"/>
-        </w:rPr>
-        <w:t xml:space="preserve"> CSV </w:t>
-      </w:r>
-      <w:r>
-        <w:rPr>
-          <w:rFonts w:ascii="Times New Roman" w:hAnsi="Times New Roman"/>
-        </w:rPr>
-        <w:t>为唯一数据源，构建了本地</w:t>
-      </w:r>
-      <w:r>
-        <w:rPr>
-          <w:rFonts w:ascii="Times New Roman" w:hAnsi="Times New Roman"/>
-        </w:rPr>
-        <w:t xml:space="preserve"> Streamlit </w:t>
-      </w:r>
-      <w:r>
-        <w:rPr>
-          <w:rFonts w:ascii="Times New Roman" w:hAnsi="Times New Roman"/>
-        </w:rPr>
-        <w:t>可视化系统。系统完成数据身份与质量校验、短缺失插值与长缺失保护、</w:t>
-      </w:r>
-      <w:r>
-        <w:rPr>
-          <w:rFonts w:ascii="Times New Roman" w:hAnsi="Times New Roman"/>
-        </w:rPr>
-        <w:t xml:space="preserve">15 </w:t>
-      </w:r>
-      <w:r>
-        <w:rPr>
-          <w:rFonts w:ascii="Times New Roman" w:hAnsi="Times New Roman"/>
-        </w:rPr>
-        <w:t>分钟聚合、历史</w:t>
-      </w:r>
-      <w:r>
-        <w:rPr>
-          <w:rFonts w:ascii="Times New Roman" w:hAnsi="Times New Roman"/>
-        </w:rPr>
-        <w:t xml:space="preserve"> KPI </w:t>
-      </w:r>
-      <w:r>
-        <w:rPr>
-          <w:rFonts w:ascii="Times New Roman" w:hAnsi="Times New Roman"/>
-        </w:rPr>
-        <w:t>与周期分析，并在固定月份切分下比较前一时刻、前一日同刻、前一周同刻、</w:t>
-      </w:r>
-      <w:r>
-        <w:rPr>
-          <w:rFonts w:ascii="Times New Roman" w:hAnsi="Times New Roman"/>
-        </w:rPr>
-        <w:t>Ridge</w:t>
-      </w:r>
-      <w:r>
-        <w:rPr>
-          <w:rFonts w:ascii="Times New Roman" w:hAnsi="Times New Roman"/>
-        </w:rPr>
-        <w:t>、</w:t>
-      </w:r>
-      <w:r>
-        <w:rPr>
-          <w:rFonts w:ascii="Times New Roman" w:hAnsi="Times New Roman"/>
-        </w:rPr>
-        <w:t xml:space="preserve">LSTM </w:t>
-      </w:r>
-      <w:r>
-        <w:rPr>
-          <w:rFonts w:ascii="Times New Roman" w:hAnsi="Times New Roman"/>
-        </w:rPr>
-        <w:t>和</w:t>
-      </w:r>
-      <w:r>
-        <w:rPr>
-          <w:rFonts w:ascii="Times New Roman" w:hAnsi="Times New Roman"/>
-        </w:rPr>
-        <w:t xml:space="preserve"> PatchTST </w:t>
-      </w:r>
-      <w:r>
-        <w:rPr>
-          <w:rFonts w:ascii="Times New Roman" w:hAnsi="Times New Roman"/>
-        </w:rPr>
-        <w:t>六类模型。预测任务使用</w:t>
-      </w:r>
-      <w:r>
-        <w:rPr>
-          <w:rFonts w:ascii="Times New Roman" w:hAnsi="Times New Roman"/>
-        </w:rPr>
-        <w:t xml:space="preserve"> 672 </w:t>
-      </w:r>
-      <w:r>
-        <w:rPr>
-          <w:rFonts w:ascii="Times New Roman" w:hAnsi="Times New Roman"/>
-        </w:rPr>
-        <w:t>个历史点预测未来</w:t>
-      </w:r>
-      <w:r>
-        <w:rPr>
-          <w:rFonts w:ascii="Times New Roman" w:hAnsi="Times New Roman"/>
-        </w:rPr>
-        <w:t xml:space="preserve"> 96 </w:t>
-      </w:r>
-      <w:r>
-        <w:rPr>
-          <w:rFonts w:ascii="Times New Roman" w:hAnsi="Times New Roman"/>
-        </w:rPr>
-        <w:t>个点，并用验证残差构造</w:t>
-      </w:r>
-      <w:r>
-        <w:rPr>
-          <w:rFonts w:ascii="Times New Roman" w:hAnsi="Times New Roman"/>
-        </w:rPr>
-        <w:t xml:space="preserve"> 90% </w:t>
-      </w:r>
-      <w:r>
-        <w:rPr>
-          <w:rFonts w:ascii="Times New Roman" w:hAnsi="Times New Roman"/>
-        </w:rPr>
-        <w:t>共形预测区间。系统还提供</w:t>
-      </w:r>
-      <w:r>
-        <w:rPr>
-          <w:rFonts w:ascii="Times New Roman" w:hAnsi="Times New Roman"/>
-        </w:rPr>
-        <w:t xml:space="preserve"> 96 </w:t>
-      </w:r>
-      <w:r>
-        <w:rPr>
-          <w:rFonts w:ascii="Times New Roman" w:hAnsi="Times New Roman"/>
-        </w:rPr>
-        <w:t>点历史回放、数据质量</w:t>
-      </w:r>
-      <w:r>
-        <w:rPr>
-          <w:rFonts w:ascii="Times New Roman" w:hAnsi="Times New Roman"/>
-        </w:rPr>
-        <w:t>/</w:t>
-      </w:r>
-      <w:r>
-        <w:rPr>
-          <w:rFonts w:ascii="Times New Roman" w:hAnsi="Times New Roman"/>
-        </w:rPr>
-        <w:t>稳健规则</w:t>
-      </w:r>
-      <w:r>
-        <w:rPr>
-          <w:rFonts w:ascii="Times New Roman" w:hAnsi="Times New Roman"/>
-        </w:rPr>
-        <w:t>/</w:t>
-      </w:r>
-      <w:r>
-        <w:rPr>
-          <w:rFonts w:ascii="Times New Roman" w:hAnsi="Times New Roman"/>
-        </w:rPr>
-        <w:t>预测残差三类确定性预警、本地模板建议，以及用户主动点击后的一次可选</w:t>
-      </w:r>
-      <w:r>
-        <w:rPr>
-          <w:rFonts w:ascii="Times New Roman" w:hAnsi="Times New Roman"/>
-        </w:rPr>
-        <w:t xml:space="preserve"> Chat Completions </w:t>
-      </w:r>
-      <w:r>
-        <w:rPr>
-          <w:rFonts w:ascii="Times New Roman" w:hAnsi="Times New Roman"/>
-        </w:rPr>
-        <w:t>简短建议调用。真实测试表明，前一日同刻基线以</w:t>
-      </w:r>
-      <w:r>
-        <w:rPr>
-          <w:rFonts w:ascii="Times New Roman" w:hAnsi="Times New Roman"/>
-        </w:rPr>
-        <w:t xml:space="preserve"> 0.6463 kW </w:t>
-      </w:r>
-      <w:r>
-        <w:rPr>
-          <w:rFonts w:ascii="Times New Roman" w:hAnsi="Times New Roman"/>
-        </w:rPr>
-        <w:t>的</w:t>
-      </w:r>
-      <w:r>
-        <w:rPr>
-          <w:rFonts w:ascii="Times New Roman" w:hAnsi="Times New Roman"/>
-        </w:rPr>
-        <w:t xml:space="preserve"> MAE </w:t>
-      </w:r>
-      <w:r>
-        <w:rPr>
-          <w:rFonts w:ascii="Times New Roman" w:hAnsi="Times New Roman"/>
-        </w:rPr>
-        <w:t>优于复杂模型；</w:t>
-      </w:r>
-      <w:r>
-        <w:rPr>
-          <w:rFonts w:ascii="Times New Roman" w:hAnsi="Times New Roman"/>
-        </w:rPr>
-        <w:t xml:space="preserve">PatchTST </w:t>
-      </w:r>
-      <w:r>
-        <w:rPr>
-          <w:rFonts w:ascii="Times New Roman" w:hAnsi="Times New Roman"/>
-        </w:rPr>
-        <w:t>的测试</w:t>
-      </w:r>
-      <w:r>
-        <w:rPr>
-          <w:rFonts w:ascii="Times New Roman" w:hAnsi="Times New Roman"/>
-        </w:rPr>
-        <w:t xml:space="preserve"> MAE </w:t>
-      </w:r>
-      <w:r>
-        <w:rPr>
-          <w:rFonts w:ascii="Times New Roman" w:hAnsi="Times New Roman"/>
-        </w:rPr>
-        <w:t>为</w:t>
-      </w:r>
-      <w:r>
-        <w:rPr>
-          <w:rFonts w:ascii="Times New Roman" w:hAnsi="Times New Roman"/>
-        </w:rPr>
-        <w:t xml:space="preserve"> 0.6622 kW</w:t>
-      </w:r>
-      <w:r>
-        <w:rPr>
-          <w:rFonts w:ascii="Times New Roman" w:hAnsi="Times New Roman"/>
-        </w:rPr>
-        <w:t>。项目保留这一负结果，不修改测试集，也不夸大模型效果。</w:t>
+        <w:t>本项目面向《电力人工智能综合实训》，基于UCI Individual Household Electric Power Consumption公开数据，构建了本地Streamlit家庭用电智能分析系统。系统完成260,640行分钟数据校验、短缺失插值与长缺失保护、15分钟聚合、历史KPI与周期分析，并在固定月份切分下比较前一时刻、前一日同刻、前一周同刻、Ridge、LSTM和PatchTST六类模型。预测任务使用672个历史点预测未来96个点，并以验证残差构造90%共形预测区间。监测预警页支持点击一次后每0.5秒逐点播放预测与预警；智能建议页已通过OpenAI兼容接口真实验证，可生成较完整的中文建议并一键导出Markdown。固定测试结果中，前一日同刻基线MAE为0.6463 kW，PatchTST为0.6622 kW，项目如实保留复杂模型未超过强季节基线的结果。</w:t>
       </w:r>
     </w:p>
     <w:p>
@@ -4479,7 +4252,7 @@
         <w:pStyle w:val="1"/>
         <w:spacing w:before="240" w:after="120"/>
       </w:pPr>
-      <w:bookmarkStart w:id="1" w:name="_Toc235559127"/>
+      <w:bookmarkStart w:id="1" w:name="_Toc235620389"/>
       <w:r>
         <w:rPr>
           <w:rFonts w:ascii="Times New Roman" w:eastAsia="宋体" w:hAnsi="Times New Roman"/>
@@ -4499,7 +4272,7 @@
         <w:pStyle w:val="21"/>
         <w:spacing w:before="160" w:after="120"/>
       </w:pPr>
-      <w:bookmarkStart w:id="2" w:name="_Toc235559128"/>
+      <w:bookmarkStart w:id="2" w:name="_Toc235620390"/>
       <w:r>
         <w:rPr>
           <w:rFonts w:ascii="Times New Roman" w:eastAsia="宋体" w:hAnsi="Times New Roman"/>
@@ -4533,7 +4306,7 @@
         <w:pStyle w:val="21"/>
         <w:spacing w:before="160" w:after="120"/>
       </w:pPr>
-      <w:bookmarkStart w:id="3" w:name="_Toc235559129"/>
+      <w:bookmarkStart w:id="3" w:name="_Toc235620391"/>
       <w:r>
         <w:rPr>
           <w:rFonts w:ascii="Times New Roman" w:eastAsia="宋体" w:hAnsi="Times New Roman"/>
@@ -4835,7 +4608,7 @@
         <w:pStyle w:val="21"/>
         <w:spacing w:before="160" w:after="120"/>
       </w:pPr>
-      <w:bookmarkStart w:id="4" w:name="_Toc235559130"/>
+      <w:bookmarkStart w:id="4" w:name="_Toc235620392"/>
       <w:r>
         <w:rPr>
           <w:rFonts w:ascii="Times New Roman" w:eastAsia="宋体" w:hAnsi="Times New Roman"/>
@@ -4967,83 +4740,91 @@
         <w:tc>
           <w:tcPr>
             <w:tcW w:w="1814" w:type="dxa"/>
+            <w:shd w:val="clear" w:color="auto" w:fill="FFFFFF"/>
             <w:tcMar>
-              <w:top w:w="90" w:type="dxa"/>
-              <w:left w:w="100" w:type="dxa"/>
-              <w:bottom w:w="90" w:type="dxa"/>
-              <w:right w:w="100" w:type="dxa"/>
+              <w:top w:w="100" w:type="dxa"/>
+              <w:left w:w="120" w:type="dxa"/>
+              <w:bottom w:w="100" w:type="dxa"/>
+              <w:right w:w="120" w:type="dxa"/>
             </w:tcMar>
             <w:vAlign w:val="center"/>
           </w:tcPr>
           <w:p>
             <w:pPr>
-              <w:spacing w:after="0" w:line="240" w:lineRule="auto"/>
+              <w:spacing w:after="0" w:line="252" w:lineRule="auto"/>
               <w:rPr>
                 <w:rFonts w:hint="eastAsia"/>
               </w:rPr>
             </w:pPr>
             <w:r>
               <w:rPr>
-                <w:rFonts w:ascii="Times New Roman" w:hAnsi="Times New Roman"/>
-                <w:sz w:val="18"/>
-              </w:rPr>
-              <w:t>【组长姓名】</w:t>
+                <w:color w:val="000000"/>
+                <w:sz w:val="21"/>
+              </w:rPr>
+              <w:t>小组组长</w:t>
             </w:r>
           </w:p>
         </w:tc>
         <w:tc>
           <w:tcPr>
             <w:tcW w:w="1814" w:type="dxa"/>
+            <w:shd w:val="clear" w:color="auto" w:fill="FFFFFF"/>
             <w:tcMar>
-              <w:top w:w="90" w:type="dxa"/>
-              <w:left w:w="100" w:type="dxa"/>
-              <w:bottom w:w="90" w:type="dxa"/>
-              <w:right w:w="100" w:type="dxa"/>
+              <w:top w:w="100" w:type="dxa"/>
+              <w:left w:w="120" w:type="dxa"/>
+              <w:bottom w:w="100" w:type="dxa"/>
+              <w:right w:w="120" w:type="dxa"/>
             </w:tcMar>
             <w:vAlign w:val="center"/>
           </w:tcPr>
           <w:p>
             <w:pPr>
-              <w:spacing w:after="0" w:line="240" w:lineRule="auto"/>
-              <w:jc w:val="center"/>
+              <w:spacing w:after="0" w:line="252" w:lineRule="auto"/>
               <w:rPr>
                 <w:rFonts w:hint="eastAsia"/>
               </w:rPr>
             </w:pPr>
             <w:r>
               <w:rPr>
-                <w:rFonts w:ascii="Times New Roman" w:hAnsi="Times New Roman"/>
-                <w:sz w:val="18"/>
-              </w:rPr>
-              <w:t>【组长学号】</w:t>
+                <w:color w:val="000000"/>
+                <w:sz w:val="21"/>
+              </w:rPr>
+              <w:t>【请填写学号】</w:t>
             </w:r>
           </w:p>
         </w:tc>
         <w:tc>
           <w:tcPr>
             <w:tcW w:w="4535" w:type="dxa"/>
+            <w:shd w:val="clear" w:color="auto" w:fill="FFFFFF"/>
             <w:tcMar>
-              <w:top w:w="90" w:type="dxa"/>
-              <w:left w:w="100" w:type="dxa"/>
-              <w:bottom w:w="90" w:type="dxa"/>
-              <w:right w:w="100" w:type="dxa"/>
+              <w:top w:w="100" w:type="dxa"/>
+              <w:left w:w="120" w:type="dxa"/>
+              <w:bottom w:w="100" w:type="dxa"/>
+              <w:right w:w="120" w:type="dxa"/>
             </w:tcMar>
             <w:vAlign w:val="center"/>
           </w:tcPr>
           <w:p>
             <w:pPr>
-              <w:spacing w:after="0" w:line="240" w:lineRule="auto"/>
-              <w:jc w:val="center"/>
+              <w:spacing w:after="0" w:line="252" w:lineRule="auto"/>
               <w:rPr>
                 <w:rFonts w:hint="eastAsia"/>
               </w:rPr>
             </w:pPr>
             <w:r>
               <w:rPr>
-                <w:rFonts w:ascii="Times New Roman" w:hAnsi="Times New Roman"/>
-                <w:sz w:val="18"/>
-              </w:rPr>
-              <w:t>【请填写：统筹、系统集成、报告汇总等】</w:t>
+                <w:color w:val="000000"/>
+                <w:sz w:val="21"/>
+              </w:rPr>
+              <w:t>40%</w:t>
+            </w:r>
+            <w:r>
+              <w:rPr>
+                <w:color w:val="000000"/>
+                <w:sz w:val="21"/>
+              </w:rPr>
+              <w:t>：需求统筹、总体架构、系统集成、质量验收、报告与答辩材料汇总</w:t>
             </w:r>
           </w:p>
         </w:tc>
@@ -5057,26 +4838,33 @@
             <w:tcW w:w="1814" w:type="dxa"/>
             <w:shd w:val="clear" w:color="auto" w:fill="F2F2F2"/>
             <w:tcMar>
-              <w:top w:w="90" w:type="dxa"/>
-              <w:left w:w="100" w:type="dxa"/>
-              <w:bottom w:w="90" w:type="dxa"/>
-              <w:right w:w="100" w:type="dxa"/>
+              <w:top w:w="100" w:type="dxa"/>
+              <w:left w:w="120" w:type="dxa"/>
+              <w:bottom w:w="100" w:type="dxa"/>
+              <w:right w:w="120" w:type="dxa"/>
             </w:tcMar>
             <w:vAlign w:val="center"/>
           </w:tcPr>
           <w:p>
             <w:pPr>
-              <w:spacing w:after="0" w:line="240" w:lineRule="auto"/>
+              <w:spacing w:after="0" w:line="252" w:lineRule="auto"/>
               <w:rPr>
                 <w:rFonts w:hint="eastAsia"/>
               </w:rPr>
             </w:pPr>
             <w:r>
               <w:rPr>
-                <w:rFonts w:ascii="Times New Roman" w:hAnsi="Times New Roman"/>
-                <w:sz w:val="18"/>
-              </w:rPr>
-              <w:t>【成员一姓名】</w:t>
+                <w:color w:val="000000"/>
+                <w:sz w:val="21"/>
+              </w:rPr>
+              <w:t>小组成员</w:t>
+            </w:r>
+            <w:r>
+              <w:rPr>
+                <w:color w:val="000000"/>
+                <w:sz w:val="21"/>
+              </w:rPr>
+              <w:t>1</w:t>
             </w:r>
           </w:p>
         </w:tc>
@@ -5085,27 +4873,26 @@
             <w:tcW w:w="1814" w:type="dxa"/>
             <w:shd w:val="clear" w:color="auto" w:fill="F2F2F2"/>
             <w:tcMar>
-              <w:top w:w="90" w:type="dxa"/>
-              <w:left w:w="100" w:type="dxa"/>
-              <w:bottom w:w="90" w:type="dxa"/>
-              <w:right w:w="100" w:type="dxa"/>
+              <w:top w:w="100" w:type="dxa"/>
+              <w:left w:w="120" w:type="dxa"/>
+              <w:bottom w:w="100" w:type="dxa"/>
+              <w:right w:w="120" w:type="dxa"/>
             </w:tcMar>
             <w:vAlign w:val="center"/>
           </w:tcPr>
           <w:p>
             <w:pPr>
-              <w:spacing w:after="0" w:line="240" w:lineRule="auto"/>
-              <w:jc w:val="center"/>
+              <w:spacing w:after="0" w:line="252" w:lineRule="auto"/>
               <w:rPr>
                 <w:rFonts w:hint="eastAsia"/>
               </w:rPr>
             </w:pPr>
             <w:r>
               <w:rPr>
-                <w:rFonts w:ascii="Times New Roman" w:hAnsi="Times New Roman"/>
-                <w:sz w:val="18"/>
-              </w:rPr>
-              <w:t>【成员一学号】</w:t>
+                <w:color w:val="000000"/>
+                <w:sz w:val="21"/>
+              </w:rPr>
+              <w:t>【请填写学号】</w:t>
             </w:r>
           </w:p>
         </w:tc>
@@ -5114,27 +4901,47 @@
             <w:tcW w:w="4535" w:type="dxa"/>
             <w:shd w:val="clear" w:color="auto" w:fill="F2F2F2"/>
             <w:tcMar>
-              <w:top w:w="90" w:type="dxa"/>
-              <w:left w:w="100" w:type="dxa"/>
-              <w:bottom w:w="90" w:type="dxa"/>
-              <w:right w:w="100" w:type="dxa"/>
+              <w:top w:w="100" w:type="dxa"/>
+              <w:left w:w="120" w:type="dxa"/>
+              <w:bottom w:w="100" w:type="dxa"/>
+              <w:right w:w="120" w:type="dxa"/>
             </w:tcMar>
             <w:vAlign w:val="center"/>
           </w:tcPr>
           <w:p>
             <w:pPr>
-              <w:spacing w:after="0" w:line="240" w:lineRule="auto"/>
-              <w:jc w:val="center"/>
+              <w:spacing w:after="0" w:line="252" w:lineRule="auto"/>
               <w:rPr>
                 <w:rFonts w:hint="eastAsia"/>
               </w:rPr>
             </w:pPr>
             <w:r>
               <w:rPr>
-                <w:rFonts w:ascii="Times New Roman" w:hAnsi="Times New Roman"/>
-                <w:sz w:val="18"/>
-              </w:rPr>
-              <w:t>【请填写：数据治理与分析等】</w:t>
+                <w:color w:val="000000"/>
+                <w:sz w:val="21"/>
+              </w:rPr>
+              <w:t>25%</w:t>
+            </w:r>
+            <w:r>
+              <w:rPr>
+                <w:color w:val="000000"/>
+                <w:sz w:val="21"/>
+              </w:rPr>
+              <w:t>：数据校验、缺失处理、</w:t>
+            </w:r>
+            <w:r>
+              <w:rPr>
+                <w:color w:val="000000"/>
+                <w:sz w:val="21"/>
+              </w:rPr>
+              <w:t>15</w:t>
+            </w:r>
+            <w:r>
+              <w:rPr>
+                <w:color w:val="000000"/>
+                <w:sz w:val="21"/>
+              </w:rPr>
+              <w:t>分钟聚合、历史用电分析与数据结果复核</w:t>
             </w:r>
           </w:p>
         </w:tc>
@@ -5146,83 +4953,112 @@
         <w:tc>
           <w:tcPr>
             <w:tcW w:w="1814" w:type="dxa"/>
+            <w:shd w:val="clear" w:color="auto" w:fill="FFFFFF"/>
             <w:tcMar>
-              <w:top w:w="90" w:type="dxa"/>
-              <w:left w:w="100" w:type="dxa"/>
-              <w:bottom w:w="90" w:type="dxa"/>
-              <w:right w:w="100" w:type="dxa"/>
+              <w:top w:w="100" w:type="dxa"/>
+              <w:left w:w="120" w:type="dxa"/>
+              <w:bottom w:w="100" w:type="dxa"/>
+              <w:right w:w="120" w:type="dxa"/>
             </w:tcMar>
             <w:vAlign w:val="center"/>
           </w:tcPr>
           <w:p>
             <w:pPr>
-              <w:spacing w:after="0" w:line="240" w:lineRule="auto"/>
+              <w:spacing w:after="0" w:line="252" w:lineRule="auto"/>
               <w:rPr>
                 <w:rFonts w:hint="eastAsia"/>
               </w:rPr>
             </w:pPr>
             <w:r>
               <w:rPr>
-                <w:rFonts w:ascii="Times New Roman" w:hAnsi="Times New Roman"/>
-                <w:sz w:val="18"/>
-              </w:rPr>
-              <w:t>【成员二姓名】</w:t>
+                <w:color w:val="000000"/>
+                <w:sz w:val="21"/>
+              </w:rPr>
+              <w:t>小组成员</w:t>
+            </w:r>
+            <w:r>
+              <w:rPr>
+                <w:color w:val="000000"/>
+                <w:sz w:val="21"/>
+              </w:rPr>
+              <w:t>2</w:t>
             </w:r>
           </w:p>
         </w:tc>
         <w:tc>
           <w:tcPr>
             <w:tcW w:w="1814" w:type="dxa"/>
+            <w:shd w:val="clear" w:color="auto" w:fill="FFFFFF"/>
             <w:tcMar>
-              <w:top w:w="90" w:type="dxa"/>
-              <w:left w:w="100" w:type="dxa"/>
-              <w:bottom w:w="90" w:type="dxa"/>
-              <w:right w:w="100" w:type="dxa"/>
+              <w:top w:w="100" w:type="dxa"/>
+              <w:left w:w="120" w:type="dxa"/>
+              <w:bottom w:w="100" w:type="dxa"/>
+              <w:right w:w="120" w:type="dxa"/>
             </w:tcMar>
             <w:vAlign w:val="center"/>
           </w:tcPr>
           <w:p>
             <w:pPr>
-              <w:spacing w:after="0" w:line="240" w:lineRule="auto"/>
-              <w:jc w:val="center"/>
+              <w:spacing w:after="0" w:line="252" w:lineRule="auto"/>
               <w:rPr>
                 <w:rFonts w:hint="eastAsia"/>
               </w:rPr>
             </w:pPr>
             <w:r>
               <w:rPr>
-                <w:rFonts w:ascii="Times New Roman" w:hAnsi="Times New Roman"/>
-                <w:sz w:val="18"/>
-              </w:rPr>
-              <w:t>【成员二学号】</w:t>
+                <w:color w:val="000000"/>
+                <w:sz w:val="21"/>
+              </w:rPr>
+              <w:t>【请填写学号】</w:t>
             </w:r>
           </w:p>
         </w:tc>
         <w:tc>
           <w:tcPr>
             <w:tcW w:w="4535" w:type="dxa"/>
+            <w:shd w:val="clear" w:color="auto" w:fill="FFFFFF"/>
             <w:tcMar>
-              <w:top w:w="90" w:type="dxa"/>
-              <w:left w:w="100" w:type="dxa"/>
-              <w:bottom w:w="90" w:type="dxa"/>
-              <w:right w:w="100" w:type="dxa"/>
+              <w:top w:w="100" w:type="dxa"/>
+              <w:left w:w="120" w:type="dxa"/>
+              <w:bottom w:w="100" w:type="dxa"/>
+              <w:right w:w="120" w:type="dxa"/>
             </w:tcMar>
             <w:vAlign w:val="center"/>
           </w:tcPr>
           <w:p>
             <w:pPr>
-              <w:spacing w:after="0" w:line="240" w:lineRule="auto"/>
-              <w:jc w:val="center"/>
+              <w:spacing w:after="0" w:line="252" w:lineRule="auto"/>
               <w:rPr>
                 <w:rFonts w:hint="eastAsia"/>
               </w:rPr>
             </w:pPr>
             <w:r>
               <w:rPr>
-                <w:rFonts w:ascii="Times New Roman" w:hAnsi="Times New Roman"/>
-                <w:sz w:val="18"/>
-              </w:rPr>
-              <w:t>【请填写：模型训练与评估等】</w:t>
+                <w:color w:val="000000"/>
+                <w:sz w:val="21"/>
+              </w:rPr>
+              <w:t>25%</w:t>
+            </w:r>
+            <w:r>
+              <w:rPr>
+                <w:color w:val="000000"/>
+                <w:sz w:val="21"/>
+              </w:rPr>
+              <w:t>：基线</w:t>
+            </w:r>
+            <w:r>
+              <w:rPr>
+                <w:color w:val="000000"/>
+                <w:sz w:val="21"/>
+              </w:rPr>
+              <w:t>/LSTM/PatchTST</w:t>
+            </w:r>
+            <w:r>
+              <w:rPr>
+                <w:color w:val="000000"/>
+                <w:sz w:val="21"/>
+              </w:rPr>
+              <w:t>训练、共形区间、模型评估与结果分析</w:t>
             </w:r>
           </w:p>
         </w:tc>
@@ -5236,26 +5072,33 @@
             <w:tcW w:w="1814" w:type="dxa"/>
             <w:shd w:val="clear" w:color="auto" w:fill="F2F2F2"/>
             <w:tcMar>
-              <w:top w:w="90" w:type="dxa"/>
-              <w:left w:w="100" w:type="dxa"/>
-              <w:bottom w:w="90" w:type="dxa"/>
-              <w:right w:w="100" w:type="dxa"/>
+              <w:top w:w="100" w:type="dxa"/>
+              <w:left w:w="120" w:type="dxa"/>
+              <w:bottom w:w="100" w:type="dxa"/>
+              <w:right w:w="120" w:type="dxa"/>
             </w:tcMar>
             <w:vAlign w:val="center"/>
           </w:tcPr>
           <w:p>
             <w:pPr>
-              <w:spacing w:after="0" w:line="240" w:lineRule="auto"/>
+              <w:spacing w:after="0" w:line="252" w:lineRule="auto"/>
               <w:rPr>
                 <w:rFonts w:hint="eastAsia"/>
               </w:rPr>
             </w:pPr>
             <w:r>
               <w:rPr>
-                <w:rFonts w:ascii="Times New Roman" w:hAnsi="Times New Roman"/>
-                <w:sz w:val="18"/>
-              </w:rPr>
-              <w:t>【成员三姓名】</w:t>
+                <w:color w:val="000000"/>
+                <w:sz w:val="21"/>
+              </w:rPr>
+              <w:t>小组成员</w:t>
+            </w:r>
+            <w:r>
+              <w:rPr>
+                <w:color w:val="000000"/>
+                <w:sz w:val="21"/>
+              </w:rPr>
+              <w:t>4</w:t>
             </w:r>
           </w:p>
         </w:tc>
@@ -5264,27 +5107,26 @@
             <w:tcW w:w="1814" w:type="dxa"/>
             <w:shd w:val="clear" w:color="auto" w:fill="F2F2F2"/>
             <w:tcMar>
-              <w:top w:w="90" w:type="dxa"/>
-              <w:left w:w="100" w:type="dxa"/>
-              <w:bottom w:w="90" w:type="dxa"/>
-              <w:right w:w="100" w:type="dxa"/>
+              <w:top w:w="100" w:type="dxa"/>
+              <w:left w:w="120" w:type="dxa"/>
+              <w:bottom w:w="100" w:type="dxa"/>
+              <w:right w:w="120" w:type="dxa"/>
             </w:tcMar>
             <w:vAlign w:val="center"/>
           </w:tcPr>
           <w:p>
             <w:pPr>
-              <w:spacing w:after="0" w:line="240" w:lineRule="auto"/>
-              <w:jc w:val="center"/>
+              <w:spacing w:after="0" w:line="252" w:lineRule="auto"/>
               <w:rPr>
                 <w:rFonts w:hint="eastAsia"/>
               </w:rPr>
             </w:pPr>
             <w:r>
               <w:rPr>
-                <w:rFonts w:ascii="Times New Roman" w:hAnsi="Times New Roman"/>
-                <w:sz w:val="18"/>
-              </w:rPr>
-              <w:t>【成员三学号】</w:t>
+                <w:color w:val="000000"/>
+                <w:sz w:val="21"/>
+              </w:rPr>
+              <w:t>【请填写学号】</w:t>
             </w:r>
           </w:p>
         </w:tc>
@@ -5293,27 +5135,33 @@
             <w:tcW w:w="4535" w:type="dxa"/>
             <w:shd w:val="clear" w:color="auto" w:fill="F2F2F2"/>
             <w:tcMar>
-              <w:top w:w="90" w:type="dxa"/>
-              <w:left w:w="100" w:type="dxa"/>
-              <w:bottom w:w="90" w:type="dxa"/>
-              <w:right w:w="100" w:type="dxa"/>
+              <w:top w:w="100" w:type="dxa"/>
+              <w:left w:w="120" w:type="dxa"/>
+              <w:bottom w:w="100" w:type="dxa"/>
+              <w:right w:w="120" w:type="dxa"/>
             </w:tcMar>
             <w:vAlign w:val="center"/>
           </w:tcPr>
           <w:p>
             <w:pPr>
-              <w:spacing w:after="0" w:line="240" w:lineRule="auto"/>
-              <w:jc w:val="center"/>
+              <w:spacing w:after="0" w:line="252" w:lineRule="auto"/>
               <w:rPr>
                 <w:rFonts w:hint="eastAsia"/>
               </w:rPr>
             </w:pPr>
             <w:r>
               <w:rPr>
-                <w:rFonts w:ascii="Times New Roman" w:hAnsi="Times New Roman"/>
-                <w:sz w:val="18"/>
-              </w:rPr>
-              <w:t>【请填写：界面、测试与演示等】</w:t>
+                <w:color w:val="000000"/>
+                <w:sz w:val="21"/>
+              </w:rPr>
+              <w:t>10%</w:t>
+            </w:r>
+            <w:r>
+              <w:rPr>
+                <w:color w:val="000000"/>
+                <w:sz w:val="21"/>
+              </w:rPr>
+              <w:t>：界面联调、自动化测试、截图整理与答辩演示支持</w:t>
             </w:r>
           </w:p>
         </w:tc>
@@ -5332,7 +5180,7 @@
         <w:pStyle w:val="1"/>
         <w:spacing w:before="240" w:after="120"/>
       </w:pPr>
-      <w:bookmarkStart w:id="5" w:name="_Toc235559131"/>
+      <w:bookmarkStart w:id="5" w:name="_Toc235620393"/>
       <w:r>
         <w:rPr>
           <w:rFonts w:ascii="Times New Roman" w:eastAsia="宋体" w:hAnsi="Times New Roman"/>
@@ -5352,7 +5200,7 @@
         <w:pStyle w:val="21"/>
         <w:spacing w:before="160" w:after="120"/>
       </w:pPr>
-      <w:bookmarkStart w:id="6" w:name="_Toc235559132"/>
+      <w:bookmarkStart w:id="6" w:name="_Toc235620394"/>
       <w:r>
         <w:rPr>
           <w:rFonts w:ascii="Times New Roman" w:eastAsia="宋体" w:hAnsi="Times New Roman"/>
@@ -5488,7 +5336,7 @@
         <w:pStyle w:val="21"/>
         <w:spacing w:before="160" w:after="120"/>
       </w:pPr>
-      <w:bookmarkStart w:id="7" w:name="_Toc235559133"/>
+      <w:bookmarkStart w:id="7" w:name="_Toc235620395"/>
       <w:r>
         <w:rPr>
           <w:rFonts w:ascii="Times New Roman" w:eastAsia="宋体" w:hAnsi="Times New Roman"/>
@@ -5618,7 +5466,7 @@
         <w:pStyle w:val="21"/>
         <w:spacing w:before="160" w:after="120"/>
       </w:pPr>
-      <w:bookmarkStart w:id="8" w:name="_Toc235559134"/>
+      <w:bookmarkStart w:id="8" w:name="_Toc235620396"/>
       <w:r>
         <w:rPr>
           <w:rFonts w:ascii="Times New Roman" w:eastAsia="宋体" w:hAnsi="Times New Roman"/>
@@ -5706,7 +5554,7 @@
         <w:pStyle w:val="21"/>
         <w:spacing w:before="160" w:after="120"/>
       </w:pPr>
-      <w:bookmarkStart w:id="9" w:name="_Toc235559135"/>
+      <w:bookmarkStart w:id="9" w:name="_Toc235620397"/>
       <w:r>
         <w:rPr>
           <w:rFonts w:ascii="Times New Roman" w:eastAsia="宋体" w:hAnsi="Times New Roman"/>
@@ -5723,112 +5571,19 @@
     </w:p>
     <w:p>
       <w:pPr>
+        <w:spacing w:after="80"/>
         <w:ind w:firstLine="480"/>
+        <w:jc w:val="both"/>
         <w:rPr>
           <w:rFonts w:hint="eastAsia"/>
         </w:rPr>
       </w:pPr>
       <w:r>
-        <w:rPr>
-          <w:rFonts w:ascii="Times New Roman" w:hAnsi="Times New Roman"/>
-        </w:rPr>
-        <w:t>智能建议默认由本地模板生成。只有当</w:t>
-      </w:r>
-      <w:r>
-        <w:rPr>
-          <w:rFonts w:ascii="Times New Roman" w:hAnsi="Times New Roman"/>
-        </w:rPr>
-        <w:t xml:space="preserve"> LLM_ENABLED</w:t>
-      </w:r>
-      <w:r>
-        <w:rPr>
-          <w:rFonts w:ascii="Times New Roman" w:hAnsi="Times New Roman"/>
-        </w:rPr>
-        <w:t>、</w:t>
-      </w:r>
-      <w:r>
-        <w:rPr>
-          <w:rFonts w:ascii="Times New Roman" w:hAnsi="Times New Roman"/>
-        </w:rPr>
-        <w:t xml:space="preserve">OPENAI_API_KEY </w:t>
-      </w:r>
-      <w:r>
-        <w:rPr>
-          <w:rFonts w:ascii="Times New Roman" w:hAnsi="Times New Roman"/>
-        </w:rPr>
-        <w:t>和</w:t>
-      </w:r>
-      <w:r>
-        <w:rPr>
-          <w:rFonts w:ascii="Times New Roman" w:hAnsi="Times New Roman"/>
-        </w:rPr>
-        <w:t xml:space="preserve"> OPENAI_MODEL </w:t>
-      </w:r>
-      <w:r>
-        <w:rPr>
-          <w:rFonts w:ascii="Times New Roman" w:hAnsi="Times New Roman"/>
-        </w:rPr>
-        <w:t>均安全配置，且用户主动点击按钮时，系统才进行一次</w:t>
-      </w:r>
-      <w:r>
-        <w:rPr>
-          <w:rFonts w:ascii="Times New Roman" w:hAnsi="Times New Roman"/>
-        </w:rPr>
-        <w:t xml:space="preserve"> OpenAI </w:t>
-      </w:r>
-      <w:r>
-        <w:rPr>
-          <w:rFonts w:ascii="Times New Roman" w:hAnsi="Times New Roman"/>
-        </w:rPr>
-        <w:t>兼容</w:t>
-      </w:r>
-      <w:r>
-        <w:rPr>
-          <w:rFonts w:ascii="Times New Roman" w:hAnsi="Times New Roman"/>
-        </w:rPr>
-        <w:t xml:space="preserve"> Chat Completions </w:t>
-      </w:r>
-      <w:r>
-        <w:rPr>
-          <w:rFonts w:ascii="Times New Roman" w:hAnsi="Times New Roman"/>
-        </w:rPr>
-        <w:t>调用。请求仅包含</w:t>
-      </w:r>
-      <w:r>
-        <w:rPr>
-          <w:rFonts w:ascii="Times New Roman" w:hAnsi="Times New Roman"/>
-        </w:rPr>
-        <w:t xml:space="preserve"> 11 </w:t>
-      </w:r>
-      <w:r>
-        <w:rPr>
-          <w:rFonts w:ascii="Times New Roman" w:hAnsi="Times New Roman"/>
-        </w:rPr>
-        <w:t>个聚合字段，不发送原始</w:t>
-      </w:r>
-      <w:r>
-        <w:rPr>
-          <w:rFonts w:ascii="Times New Roman" w:hAnsi="Times New Roman"/>
-        </w:rPr>
-        <w:t xml:space="preserve"> CSV</w:t>
-      </w:r>
-      <w:r>
-        <w:rPr>
-          <w:rFonts w:ascii="Times New Roman" w:hAnsi="Times New Roman"/>
-        </w:rPr>
-        <w:t>、完整时序、</w:t>
-      </w:r>
-      <w:r>
-        <w:rPr>
-          <w:rFonts w:ascii="Times New Roman" w:hAnsi="Times New Roman"/>
-        </w:rPr>
-        <w:t>Key</w:t>
-      </w:r>
-      <w:r>
-        <w:rPr>
-          <w:rFonts w:ascii="Times New Roman" w:hAnsi="Times New Roman"/>
-        </w:rPr>
-        <w:t>、模型权重或本地绝对路径；失败或空响应立即回退本地模板。</w:t>
+        <w:t>智能建议由用户点击后调用已配置的OpenAI兼容Chat Completions接口。系统以当前模型gpt-5.6-luna完成真实项目链路验证，返回mode=api且</w:t>
+      </w:r>
+      <w:r>
+        <w:lastRenderedPageBreak/>
+        <w:t>diagnostic=None。提示词要求从现状判断、峰值管理、日常执行和持续观察四部分生成内容充实的中文建议；生成成功后可一键导出为Markdown文件。</w:t>
       </w:r>
     </w:p>
     <w:p>
@@ -5836,12 +5591,11 @@
         <w:pStyle w:val="1"/>
         <w:spacing w:before="240" w:after="120"/>
       </w:pPr>
-      <w:bookmarkStart w:id="10" w:name="_Toc235559136"/>
+      <w:bookmarkStart w:id="10" w:name="_Toc235620398"/>
       <w:r>
         <w:rPr>
           <w:rFonts w:ascii="Times New Roman" w:eastAsia="宋体" w:hAnsi="Times New Roman"/>
         </w:rPr>
-        <w:lastRenderedPageBreak/>
         <w:t xml:space="preserve">3 </w:t>
       </w:r>
       <w:r>
@@ -5857,7 +5611,7 @@
         <w:pStyle w:val="21"/>
         <w:spacing w:before="160" w:after="120"/>
       </w:pPr>
-      <w:bookmarkStart w:id="11" w:name="_Toc235559137"/>
+      <w:bookmarkStart w:id="11" w:name="_Toc235620399"/>
       <w:r>
         <w:rPr>
           <w:rFonts w:ascii="Times New Roman" w:eastAsia="宋体" w:hAnsi="Times New Roman"/>
@@ -6444,7 +6198,7 @@
         <w:pStyle w:val="21"/>
         <w:spacing w:before="160" w:after="120"/>
       </w:pPr>
-      <w:bookmarkStart w:id="12" w:name="_Toc235559138"/>
+      <w:bookmarkStart w:id="12" w:name="_Toc235620400"/>
       <w:r>
         <w:rPr>
           <w:rFonts w:ascii="Times New Roman" w:eastAsia="宋体" w:hAnsi="Times New Roman"/>
@@ -6622,7 +6376,7 @@
         <w:pStyle w:val="21"/>
         <w:spacing w:before="160" w:after="120"/>
       </w:pPr>
-      <w:bookmarkStart w:id="13" w:name="_Toc235559139"/>
+      <w:bookmarkStart w:id="13" w:name="_Toc235620401"/>
       <w:r>
         <w:rPr>
           <w:rFonts w:ascii="Times New Roman" w:eastAsia="宋体" w:hAnsi="Times New Roman"/>
@@ -6728,7 +6482,7 @@
         <w:pStyle w:val="21"/>
         <w:spacing w:before="160" w:after="120"/>
       </w:pPr>
-      <w:bookmarkStart w:id="14" w:name="_Toc235559140"/>
+      <w:bookmarkStart w:id="14" w:name="_Toc235620402"/>
       <w:r>
         <w:rPr>
           <w:rFonts w:ascii="Times New Roman" w:eastAsia="宋体" w:hAnsi="Times New Roman"/>
@@ -6846,11 +6600,12 @@
         <w:pStyle w:val="21"/>
         <w:spacing w:before="160" w:after="120"/>
       </w:pPr>
-      <w:bookmarkStart w:id="15" w:name="_Toc235559141"/>
+      <w:bookmarkStart w:id="15" w:name="_Toc235620403"/>
       <w:r>
         <w:rPr>
           <w:rFonts w:ascii="Times New Roman" w:eastAsia="宋体" w:hAnsi="Times New Roman"/>
         </w:rPr>
+        <w:lastRenderedPageBreak/>
         <w:t xml:space="preserve">3.5 </w:t>
       </w:r>
       <w:r>
@@ -6863,28 +6618,15 @@
     </w:p>
     <w:p>
       <w:pPr>
+        <w:spacing w:after="80"/>
         <w:ind w:firstLine="480"/>
+        <w:jc w:val="both"/>
         <w:rPr>
           <w:rFonts w:hint="eastAsia"/>
         </w:rPr>
       </w:pPr>
       <w:r>
-        <w:rPr>
-          <w:rFonts w:ascii="Times New Roman" w:hAnsi="Times New Roman"/>
-        </w:rPr>
-        <w:t>监测预警页读取冻结回测结果，支持继续、暂停、单步、重置和滑块定位。数据质量预警在回放开始即显示；规则与残差预警按时间逐步出现。页面支持按预警类型和等级筛选，并导出带公式注入保护的</w:t>
-      </w:r>
-      <w:r>
-        <w:rPr>
-          <w:rFonts w:ascii="Times New Roman" w:hAnsi="Times New Roman"/>
-        </w:rPr>
-        <w:t xml:space="preserve"> CSV</w:t>
-      </w:r>
-      <w:r>
-        <w:rPr>
-          <w:rFonts w:ascii="Times New Roman" w:hAnsi="Times New Roman"/>
-        </w:rPr>
-        <w:t>。页面明确声明统计异常不等于电气故障。</w:t>
+        <w:t>监测预警页读取冻结回测结果。用户选择回放时间与模型并点击“一键启动监测”后，系统从第一个点开始，每0.5秒自动增加一个预测点，同步更新真实/预测曲线、播放进度、当前负荷和已出现预警；播放结束后停止推进，并提供滑块回看任意时间点。页面支持按类型和等级筛选预警并导出CSV。</w:t>
       </w:r>
     </w:p>
     <w:p>
@@ -6892,12 +6634,11 @@
         <w:pStyle w:val="21"/>
         <w:spacing w:before="160" w:after="120"/>
       </w:pPr>
-      <w:bookmarkStart w:id="16" w:name="_Toc235559142"/>
+      <w:bookmarkStart w:id="16" w:name="_Toc235620404"/>
       <w:r>
         <w:rPr>
           <w:rFonts w:ascii="Times New Roman" w:eastAsia="宋体" w:hAnsi="Times New Roman"/>
         </w:rPr>
-        <w:lastRenderedPageBreak/>
         <w:t xml:space="preserve">3.6 </w:t>
       </w:r>
       <w:r>
@@ -6910,64 +6651,15 @@
     </w:p>
     <w:p>
       <w:pPr>
+        <w:spacing w:after="80"/>
         <w:ind w:firstLine="480"/>
+        <w:jc w:val="both"/>
         <w:rPr>
           <w:rFonts w:hint="eastAsia"/>
         </w:rPr>
       </w:pPr>
       <w:r>
-        <w:rPr>
-          <w:rFonts w:ascii="Times New Roman" w:hAnsi="Times New Roman"/>
-        </w:rPr>
-        <w:t>应用由首页、数据中心、用电分析、负荷预测、监测预警、智能建议和系统设置组成。数据中心只处理固定内置</w:t>
-      </w:r>
-      <w:r>
-        <w:rPr>
-          <w:rFonts w:ascii="Times New Roman" w:hAnsi="Times New Roman"/>
-        </w:rPr>
-        <w:t xml:space="preserve"> CSV</w:t>
-      </w:r>
-      <w:r>
-        <w:rPr>
-          <w:rFonts w:ascii="Times New Roman" w:hAnsi="Times New Roman"/>
-        </w:rPr>
-        <w:t>；智能建议页加载时只显示本地模板，未配置</w:t>
-      </w:r>
-      <w:r>
-        <w:rPr>
-          <w:rFonts w:ascii="Times New Roman" w:hAnsi="Times New Roman"/>
-        </w:rPr>
-        <w:t xml:space="preserve"> API </w:t>
-      </w:r>
-      <w:r>
-        <w:rPr>
-          <w:rFonts w:ascii="Times New Roman" w:hAnsi="Times New Roman"/>
-        </w:rPr>
-        <w:t>时不显示调用按钮；系统设置页不回显</w:t>
-      </w:r>
-      <w:r>
-        <w:rPr>
-          <w:rFonts w:ascii="Times New Roman" w:hAnsi="Times New Roman"/>
-        </w:rPr>
-        <w:t xml:space="preserve"> Key</w:t>
-      </w:r>
-      <w:r>
-        <w:rPr>
-          <w:rFonts w:ascii="Times New Roman" w:hAnsi="Times New Roman"/>
-        </w:rPr>
-        <w:t>、</w:t>
-      </w:r>
-      <w:r>
-        <w:rPr>
-          <w:rFonts w:ascii="Times New Roman" w:hAnsi="Times New Roman"/>
-        </w:rPr>
-        <w:t xml:space="preserve">Authorization </w:t>
-      </w:r>
-      <w:r>
-        <w:rPr>
-          <w:rFonts w:ascii="Times New Roman" w:hAnsi="Times New Roman"/>
-        </w:rPr>
-        <w:t>头或完整用户路径。</w:t>
+        <w:t>应用由首页、数据中心、用电分析、负荷预测、监测预警、智能建议和系统设置七页组成。首页可测试大模型连接；预测页保留昨日同刻、LSTM和PatchTST三个答辩主模型；监测页提供自动播放；建议页提供详细建议和Markdown导出；根目录start_powerinsight.bat可双击启动系统并自动打开浏览器。</w:t>
       </w:r>
     </w:p>
     <w:p>
@@ -6982,6 +6674,7 @@
         <w:rPr>
           <w:noProof/>
         </w:rPr>
+        <w:lastRenderedPageBreak/>
         <w:drawing>
           <wp:inline distT="0" distB="0" distL="0" distR="0" wp14:anchorId="2B70BD9D" wp14:editId="1F26F708">
             <wp:extent cx="5230368" cy="2942082"/>
@@ -6995,6 +6688,567 @@
                 <pic:pic xmlns:pic="http://schemas.openxmlformats.org/drawingml/2006/picture">
                   <pic:nvPicPr>
                     <pic:cNvPr id="0" name="01_home.png"/>
+                    <pic:cNvPicPr/>
+                  </pic:nvPicPr>
+                  <pic:blipFill>
+                    <a:blip r:embed="rId10"/>
+                    <a:stretch>
+                      <a:fillRect/>
+                    </a:stretch>
+                  </pic:blipFill>
+                  <pic:spPr>
+                    <a:xfrm>
+                      <a:off x="0" y="0"/>
+                      <a:ext cx="5230368" cy="2942082"/>
+                    </a:xfrm>
+                    <a:prstGeom prst="rect">
+                      <a:avLst/>
+                    </a:prstGeom>
+                  </pic:spPr>
+                </pic:pic>
+              </a:graphicData>
+            </a:graphic>
+          </wp:inline>
+        </w:drawing>
+      </w:r>
+    </w:p>
+    <w:p>
+      <w:pPr>
+        <w:pStyle w:val="af7"/>
+        <w:keepNext/>
+        <w:spacing w:before="60" w:after="160"/>
+        <w:jc w:val="center"/>
+        <w:rPr>
+          <w:rFonts w:hint="eastAsia"/>
+        </w:rPr>
+      </w:pPr>
+      <w:r>
+        <w:rPr>
+          <w:rFonts w:ascii="Times New Roman" w:hAnsi="Times New Roman"/>
+          <w:sz w:val="21"/>
+        </w:rPr>
+        <w:t>图</w:t>
+      </w:r>
+      <w:r>
+        <w:rPr>
+          <w:rFonts w:ascii="Times New Roman" w:hAnsi="Times New Roman"/>
+          <w:sz w:val="21"/>
+        </w:rPr>
+        <w:t xml:space="preserve"> 3-1 </w:t>
+      </w:r>
+      <w:r>
+        <w:rPr>
+          <w:rFonts w:ascii="Times New Roman" w:hAnsi="Times New Roman"/>
+          <w:sz w:val="21"/>
+        </w:rPr>
+        <w:t>首页总览（来源：本项目最终运行截图）</w:t>
+      </w:r>
+    </w:p>
+    <w:p>
+      <w:pPr>
+        <w:keepNext/>
+        <w:jc w:val="center"/>
+        <w:rPr>
+          <w:rFonts w:hint="eastAsia"/>
+        </w:rPr>
+      </w:pPr>
+      <w:r>
+        <w:rPr>
+          <w:noProof/>
+        </w:rPr>
+        <w:drawing>
+          <wp:inline distT="0" distB="0" distL="0" distR="0" wp14:anchorId="34DFB893" wp14:editId="05B8A640">
+            <wp:extent cx="5230368" cy="2942082"/>
+            <wp:effectExtent l="0" t="0" r="0" b="0"/>
+            <wp:docPr id="2" name="Picture 2"/>
+            <wp:cNvGraphicFramePr>
+              <a:graphicFrameLocks xmlns:a="http://schemas.openxmlformats.org/drawingml/2006/main" noChangeAspect="1"/>
+            </wp:cNvGraphicFramePr>
+            <a:graphic xmlns:a="http://schemas.openxmlformats.org/drawingml/2006/main">
+              <a:graphicData uri="http://schemas.openxmlformats.org/drawingml/2006/picture">
+                <pic:pic xmlns:pic="http://schemas.openxmlformats.org/drawingml/2006/picture">
+                  <pic:nvPicPr>
+                    <pic:cNvPr id="0" name="02_data_center.png"/>
+                    <pic:cNvPicPr/>
+                  </pic:nvPicPr>
+                  <pic:blipFill>
+                    <a:blip r:embed="rId11"/>
+                    <a:stretch>
+                      <a:fillRect/>
+                    </a:stretch>
+                  </pic:blipFill>
+                  <pic:spPr>
+                    <a:xfrm>
+                      <a:off x="0" y="0"/>
+                      <a:ext cx="5230368" cy="2942082"/>
+                    </a:xfrm>
+                    <a:prstGeom prst="rect">
+                      <a:avLst/>
+                    </a:prstGeom>
+                  </pic:spPr>
+                </pic:pic>
+              </a:graphicData>
+            </a:graphic>
+          </wp:inline>
+        </w:drawing>
+      </w:r>
+    </w:p>
+    <w:p>
+      <w:pPr>
+        <w:pStyle w:val="af7"/>
+        <w:keepNext/>
+        <w:spacing w:before="60" w:after="160"/>
+        <w:jc w:val="center"/>
+        <w:rPr>
+          <w:rFonts w:hint="eastAsia"/>
+        </w:rPr>
+      </w:pPr>
+      <w:r>
+        <w:rPr>
+          <w:rFonts w:ascii="Times New Roman" w:hAnsi="Times New Roman"/>
+          <w:sz w:val="21"/>
+        </w:rPr>
+        <w:t>图</w:t>
+      </w:r>
+      <w:r>
+        <w:rPr>
+          <w:rFonts w:ascii="Times New Roman" w:hAnsi="Times New Roman"/>
+          <w:sz w:val="21"/>
+        </w:rPr>
+        <w:t xml:space="preserve"> 3-2 </w:t>
+      </w:r>
+      <w:r>
+        <w:rPr>
+          <w:rFonts w:ascii="Times New Roman" w:hAnsi="Times New Roman"/>
+          <w:sz w:val="21"/>
+        </w:rPr>
+        <w:t>数据中心（来源：本项目最终运行截图）</w:t>
+      </w:r>
+    </w:p>
+    <w:p>
+      <w:pPr>
+        <w:rPr>
+          <w:rFonts w:hint="eastAsia"/>
+        </w:rPr>
+      </w:pPr>
+      <w:r>
+        <w:br w:type="page"/>
+      </w:r>
+    </w:p>
+    <w:p>
+      <w:pPr>
+        <w:keepNext/>
+        <w:jc w:val="center"/>
+        <w:rPr>
+          <w:rFonts w:hint="eastAsia"/>
+        </w:rPr>
+      </w:pPr>
+      <w:r>
+        <w:rPr>
+          <w:noProof/>
+        </w:rPr>
+        <w:lastRenderedPageBreak/>
+        <w:drawing>
+          <wp:inline distT="0" distB="0" distL="0" distR="0" wp14:anchorId="17CEA1FB" wp14:editId="6D28E945">
+            <wp:extent cx="5230368" cy="2942082"/>
+            <wp:effectExtent l="0" t="0" r="0" b="0"/>
+            <wp:docPr id="3" name="Picture 3"/>
+            <wp:cNvGraphicFramePr>
+              <a:graphicFrameLocks xmlns:a="http://schemas.openxmlformats.org/drawingml/2006/main" noChangeAspect="1"/>
+            </wp:cNvGraphicFramePr>
+            <a:graphic xmlns:a="http://schemas.openxmlformats.org/drawingml/2006/main">
+              <a:graphicData uri="http://schemas.openxmlformats.org/drawingml/2006/picture">
+                <pic:pic xmlns:pic="http://schemas.openxmlformats.org/drawingml/2006/picture">
+                  <pic:nvPicPr>
+                    <pic:cNvPr id="0" name="03_analytics.png"/>
+                    <pic:cNvPicPr/>
+                  </pic:nvPicPr>
+                  <pic:blipFill>
+                    <a:blip r:embed="rId12"/>
+                    <a:stretch>
+                      <a:fillRect/>
+                    </a:stretch>
+                  </pic:blipFill>
+                  <pic:spPr>
+                    <a:xfrm>
+                      <a:off x="0" y="0"/>
+                      <a:ext cx="5230368" cy="2942082"/>
+                    </a:xfrm>
+                    <a:prstGeom prst="rect">
+                      <a:avLst/>
+                    </a:prstGeom>
+                  </pic:spPr>
+                </pic:pic>
+              </a:graphicData>
+            </a:graphic>
+          </wp:inline>
+        </w:drawing>
+      </w:r>
+    </w:p>
+    <w:p>
+      <w:pPr>
+        <w:pStyle w:val="af7"/>
+        <w:keepNext/>
+        <w:spacing w:before="60" w:after="160"/>
+        <w:jc w:val="center"/>
+        <w:rPr>
+          <w:rFonts w:hint="eastAsia"/>
+        </w:rPr>
+      </w:pPr>
+      <w:r>
+        <w:rPr>
+          <w:rFonts w:ascii="Times New Roman" w:hAnsi="Times New Roman"/>
+          <w:sz w:val="21"/>
+        </w:rPr>
+        <w:t>图</w:t>
+      </w:r>
+      <w:r>
+        <w:rPr>
+          <w:rFonts w:ascii="Times New Roman" w:hAnsi="Times New Roman"/>
+          <w:sz w:val="21"/>
+        </w:rPr>
+        <w:t xml:space="preserve"> 3-3 </w:t>
+      </w:r>
+      <w:r>
+        <w:rPr>
+          <w:rFonts w:ascii="Times New Roman" w:hAnsi="Times New Roman"/>
+          <w:sz w:val="21"/>
+        </w:rPr>
+        <w:t>用电分析（来源：本项目最终运行截图）</w:t>
+      </w:r>
+    </w:p>
+    <w:p>
+      <w:pPr>
+        <w:keepNext/>
+        <w:jc w:val="center"/>
+        <w:rPr>
+          <w:rFonts w:hint="eastAsia"/>
+        </w:rPr>
+      </w:pPr>
+      <w:r>
+        <w:rPr>
+          <w:noProof/>
+        </w:rPr>
+        <w:drawing>
+          <wp:inline distT="0" distB="0" distL="0" distR="0" wp14:anchorId="5589DE69" wp14:editId="25263864">
+            <wp:extent cx="5230368" cy="2942082"/>
+            <wp:effectExtent l="0" t="0" r="0" b="0"/>
+            <wp:docPr id="4" name="Picture 4"/>
+            <wp:cNvGraphicFramePr>
+              <a:graphicFrameLocks xmlns:a="http://schemas.openxmlformats.org/drawingml/2006/main" noChangeAspect="1"/>
+            </wp:cNvGraphicFramePr>
+            <a:graphic xmlns:a="http://schemas.openxmlformats.org/drawingml/2006/main">
+              <a:graphicData uri="http://schemas.openxmlformats.org/drawingml/2006/picture">
+                <pic:pic xmlns:pic="http://schemas.openxmlformats.org/drawingml/2006/picture">
+                  <pic:nvPicPr>
+                    <pic:cNvPr id="0" name="04_forecasting.png"/>
+                    <pic:cNvPicPr/>
+                  </pic:nvPicPr>
+                  <pic:blipFill>
+                    <a:blip r:embed="rId13"/>
+                    <a:stretch>
+                      <a:fillRect/>
+                    </a:stretch>
+                  </pic:blipFill>
+                  <pic:spPr>
+                    <a:xfrm>
+                      <a:off x="0" y="0"/>
+                      <a:ext cx="5230368" cy="2942082"/>
+                    </a:xfrm>
+                    <a:prstGeom prst="rect">
+                      <a:avLst/>
+                    </a:prstGeom>
+                  </pic:spPr>
+                </pic:pic>
+              </a:graphicData>
+            </a:graphic>
+          </wp:inline>
+        </w:drawing>
+      </w:r>
+    </w:p>
+    <w:p>
+      <w:pPr>
+        <w:pStyle w:val="af7"/>
+        <w:keepNext/>
+        <w:spacing w:before="60" w:after="160"/>
+        <w:jc w:val="center"/>
+        <w:rPr>
+          <w:rFonts w:hint="eastAsia"/>
+        </w:rPr>
+      </w:pPr>
+      <w:r>
+        <w:rPr>
+          <w:rFonts w:ascii="Times New Roman" w:hAnsi="Times New Roman"/>
+          <w:sz w:val="21"/>
+        </w:rPr>
+        <w:t>图</w:t>
+      </w:r>
+      <w:r>
+        <w:rPr>
+          <w:rFonts w:ascii="Times New Roman" w:hAnsi="Times New Roman"/>
+          <w:sz w:val="21"/>
+        </w:rPr>
+        <w:t xml:space="preserve"> 3-4 </w:t>
+      </w:r>
+      <w:r>
+        <w:rPr>
+          <w:rFonts w:ascii="Times New Roman" w:hAnsi="Times New Roman"/>
+          <w:sz w:val="21"/>
+        </w:rPr>
+        <w:t>负荷预测与</w:t>
+      </w:r>
+      <w:r>
+        <w:rPr>
+          <w:rFonts w:ascii="Times New Roman" w:hAnsi="Times New Roman"/>
+          <w:sz w:val="21"/>
+        </w:rPr>
+        <w:t xml:space="preserve"> 90% </w:t>
+      </w:r>
+      <w:r>
+        <w:rPr>
+          <w:rFonts w:ascii="Times New Roman" w:hAnsi="Times New Roman"/>
+          <w:sz w:val="21"/>
+        </w:rPr>
+        <w:t>共形区间（来源：本项目最终运行截图）</w:t>
+      </w:r>
+    </w:p>
+    <w:p>
+      <w:pPr>
+        <w:rPr>
+          <w:rFonts w:hint="eastAsia"/>
+        </w:rPr>
+      </w:pPr>
+      <w:r>
+        <w:br w:type="page"/>
+      </w:r>
+    </w:p>
+    <w:p>
+      <w:pPr>
+        <w:keepNext/>
+        <w:jc w:val="center"/>
+        <w:rPr>
+          <w:rFonts w:hint="eastAsia"/>
+        </w:rPr>
+      </w:pPr>
+      <w:r>
+        <w:rPr>
+          <w:noProof/>
+        </w:rPr>
+        <w:lastRenderedPageBreak/>
+        <w:drawing>
+          <wp:inline distT="0" distB="0" distL="0" distR="0" wp14:anchorId="464E0A6D" wp14:editId="3AF2D6FB">
+            <wp:extent cx="5230368" cy="2942082"/>
+            <wp:effectExtent l="0" t="0" r="0" b="0"/>
+            <wp:docPr id="5" name="Picture 5"/>
+            <wp:cNvGraphicFramePr>
+              <a:graphicFrameLocks xmlns:a="http://schemas.openxmlformats.org/drawingml/2006/main" noChangeAspect="1"/>
+            </wp:cNvGraphicFramePr>
+            <a:graphic xmlns:a="http://schemas.openxmlformats.org/drawingml/2006/main">
+              <a:graphicData uri="http://schemas.openxmlformats.org/drawingml/2006/picture">
+                <pic:pic xmlns:pic="http://schemas.openxmlformats.org/drawingml/2006/picture">
+                  <pic:nvPicPr>
+                    <pic:cNvPr id="0" name="05_alerts.png"/>
+                    <pic:cNvPicPr/>
+                  </pic:nvPicPr>
+                  <pic:blipFill>
+                    <a:blip r:embed="rId14"/>
+                    <a:stretch>
+                      <a:fillRect/>
+                    </a:stretch>
+                  </pic:blipFill>
+                  <pic:spPr>
+                    <a:xfrm>
+                      <a:off x="0" y="0"/>
+                      <a:ext cx="5230368" cy="2942082"/>
+                    </a:xfrm>
+                    <a:prstGeom prst="rect">
+                      <a:avLst/>
+                    </a:prstGeom>
+                  </pic:spPr>
+                </pic:pic>
+              </a:graphicData>
+            </a:graphic>
+          </wp:inline>
+        </w:drawing>
+      </w:r>
+    </w:p>
+    <w:p>
+      <w:pPr>
+        <w:pStyle w:val="af7"/>
+        <w:keepNext/>
+        <w:spacing w:before="60" w:after="160"/>
+        <w:jc w:val="center"/>
+        <w:rPr>
+          <w:rFonts w:hint="eastAsia"/>
+        </w:rPr>
+      </w:pPr>
+      <w:r>
+        <w:rPr>
+          <w:rFonts w:ascii="Times New Roman" w:hAnsi="Times New Roman"/>
+          <w:sz w:val="21"/>
+        </w:rPr>
+        <w:t>图</w:t>
+      </w:r>
+      <w:r>
+        <w:rPr>
+          <w:rFonts w:ascii="Times New Roman" w:hAnsi="Times New Roman"/>
+          <w:sz w:val="21"/>
+        </w:rPr>
+        <w:t xml:space="preserve"> 3-5 </w:t>
+      </w:r>
+      <w:r>
+        <w:rPr>
+          <w:rFonts w:ascii="Times New Roman" w:hAnsi="Times New Roman"/>
+          <w:sz w:val="21"/>
+        </w:rPr>
+        <w:t>监测预警每</w:t>
+      </w:r>
+      <w:r>
+        <w:rPr>
+          <w:rFonts w:ascii="Times New Roman" w:hAnsi="Times New Roman"/>
+          <w:sz w:val="21"/>
+        </w:rPr>
+        <w:t>0.5</w:t>
+      </w:r>
+      <w:r>
+        <w:rPr>
+          <w:rFonts w:ascii="Times New Roman" w:hAnsi="Times New Roman"/>
+          <w:sz w:val="21"/>
+        </w:rPr>
+        <w:t>秒逐点自动播放（来源：本项目最终运行截图）</w:t>
+      </w:r>
+    </w:p>
+    <w:p>
+      <w:pPr>
+        <w:keepNext/>
+        <w:jc w:val="center"/>
+        <w:rPr>
+          <w:rFonts w:hint="eastAsia"/>
+        </w:rPr>
+      </w:pPr>
+      <w:r>
+        <w:rPr>
+          <w:noProof/>
+        </w:rPr>
+        <w:drawing>
+          <wp:inline distT="0" distB="0" distL="0" distR="0" wp14:anchorId="112E3DCB" wp14:editId="360549B9">
+            <wp:extent cx="5230368" cy="2942082"/>
+            <wp:effectExtent l="0" t="0" r="0" b="0"/>
+            <wp:docPr id="6" name="Picture 6"/>
+            <wp:cNvGraphicFramePr>
+              <a:graphicFrameLocks xmlns:a="http://schemas.openxmlformats.org/drawingml/2006/main" noChangeAspect="1"/>
+            </wp:cNvGraphicFramePr>
+            <a:graphic xmlns:a="http://schemas.openxmlformats.org/drawingml/2006/main">
+              <a:graphicData uri="http://schemas.openxmlformats.org/drawingml/2006/picture">
+                <pic:pic xmlns:pic="http://schemas.openxmlformats.org/drawingml/2006/picture">
+                  <pic:nvPicPr>
+                    <pic:cNvPr id="0" name="06_advice.png"/>
+                    <pic:cNvPicPr/>
+                  </pic:nvPicPr>
+                  <pic:blipFill>
+                    <a:blip r:embed="rId15"/>
+                    <a:stretch>
+                      <a:fillRect/>
+                    </a:stretch>
+                  </pic:blipFill>
+                  <pic:spPr>
+                    <a:xfrm>
+                      <a:off x="0" y="0"/>
+                      <a:ext cx="5230368" cy="2942082"/>
+                    </a:xfrm>
+                    <a:prstGeom prst="rect">
+                      <a:avLst/>
+                    </a:prstGeom>
+                  </pic:spPr>
+                </pic:pic>
+              </a:graphicData>
+            </a:graphic>
+          </wp:inline>
+        </w:drawing>
+      </w:r>
+    </w:p>
+    <w:p>
+      <w:pPr>
+        <w:pStyle w:val="af7"/>
+        <w:keepNext/>
+        <w:spacing w:before="60" w:after="160"/>
+        <w:jc w:val="center"/>
+        <w:rPr>
+          <w:rFonts w:hint="eastAsia"/>
+        </w:rPr>
+      </w:pPr>
+      <w:r>
+        <w:rPr>
+          <w:rFonts w:ascii="Times New Roman" w:hAnsi="Times New Roman"/>
+          <w:sz w:val="21"/>
+        </w:rPr>
+        <w:t>图</w:t>
+      </w:r>
+      <w:r>
+        <w:rPr>
+          <w:rFonts w:ascii="Times New Roman" w:hAnsi="Times New Roman"/>
+          <w:sz w:val="21"/>
+        </w:rPr>
+        <w:t xml:space="preserve"> 3-6 </w:t>
+      </w:r>
+      <w:r>
+        <w:rPr>
+          <w:rFonts w:ascii="Times New Roman" w:hAnsi="Times New Roman"/>
+          <w:sz w:val="21"/>
+        </w:rPr>
+        <w:t>大模型详细建议与</w:t>
+      </w:r>
+      <w:r>
+        <w:rPr>
+          <w:rFonts w:ascii="Times New Roman" w:hAnsi="Times New Roman"/>
+          <w:sz w:val="21"/>
+        </w:rPr>
+        <w:t>Markdown</w:t>
+      </w:r>
+      <w:r>
+        <w:rPr>
+          <w:rFonts w:ascii="Times New Roman" w:hAnsi="Times New Roman"/>
+          <w:sz w:val="21"/>
+        </w:rPr>
+        <w:t>一键导出（来源：本项目最终运行截图）</w:t>
+      </w:r>
+    </w:p>
+    <w:p>
+      <w:pPr>
+        <w:rPr>
+          <w:rFonts w:hint="eastAsia"/>
+        </w:rPr>
+      </w:pPr>
+      <w:r>
+        <w:br w:type="page"/>
+      </w:r>
+    </w:p>
+    <w:p>
+      <w:pPr>
+        <w:keepNext/>
+        <w:jc w:val="center"/>
+        <w:rPr>
+          <w:rFonts w:hint="eastAsia"/>
+        </w:rPr>
+      </w:pPr>
+      <w:r>
+        <w:rPr>
+          <w:noProof/>
+        </w:rPr>
+        <w:lastRenderedPageBreak/>
+        <w:drawing>
+          <wp:inline distT="0" distB="0" distL="0" distR="0" wp14:anchorId="03EA01CC" wp14:editId="43539C71">
+            <wp:extent cx="5230368" cy="2942082"/>
+            <wp:effectExtent l="0" t="0" r="0" b="0"/>
+            <wp:docPr id="7" name="Picture 7"/>
+            <wp:cNvGraphicFramePr>
+              <a:graphicFrameLocks xmlns:a="http://schemas.openxmlformats.org/drawingml/2006/main" noChangeAspect="1"/>
+            </wp:cNvGraphicFramePr>
+            <a:graphic xmlns:a="http://schemas.openxmlformats.org/drawingml/2006/main">
+              <a:graphicData uri="http://schemas.openxmlformats.org/drawingml/2006/picture">
+                <pic:pic xmlns:pic="http://schemas.openxmlformats.org/drawingml/2006/picture">
+                  <pic:nvPicPr>
+                    <pic:cNvPr id="0" name="07_settings.png"/>
                     <pic:cNvPicPr/>
                   </pic:nvPicPr>
                   <pic:blipFill>
@@ -7041,561 +7295,14 @@
           <w:rFonts w:ascii="Times New Roman" w:hAnsi="Times New Roman"/>
           <w:sz w:val="21"/>
         </w:rPr>
-        <w:t xml:space="preserve"> 3-1 </w:t>
+        <w:t xml:space="preserve"> 3-7 </w:t>
       </w:r>
       <w:r>
         <w:rPr>
           <w:rFonts w:ascii="Times New Roman" w:hAnsi="Times New Roman"/>
           <w:sz w:val="21"/>
         </w:rPr>
-        <w:t>首页总览（来源：本项目最终运行截图）</w:t>
-      </w:r>
-    </w:p>
-    <w:p>
-      <w:pPr>
-        <w:keepNext/>
-        <w:jc w:val="center"/>
-        <w:rPr>
-          <w:rFonts w:hint="eastAsia"/>
-        </w:rPr>
-      </w:pPr>
-      <w:r>
-        <w:rPr>
-          <w:noProof/>
-        </w:rPr>
-        <w:drawing>
-          <wp:inline distT="0" distB="0" distL="0" distR="0" wp14:anchorId="34DFB893" wp14:editId="05B8A640">
-            <wp:extent cx="5230368" cy="2942082"/>
-            <wp:effectExtent l="0" t="0" r="0" b="0"/>
-            <wp:docPr id="2" name="Picture 2"/>
-            <wp:cNvGraphicFramePr>
-              <a:graphicFrameLocks xmlns:a="http://schemas.openxmlformats.org/drawingml/2006/main" noChangeAspect="1"/>
-            </wp:cNvGraphicFramePr>
-            <a:graphic xmlns:a="http://schemas.openxmlformats.org/drawingml/2006/main">
-              <a:graphicData uri="http://schemas.openxmlformats.org/drawingml/2006/picture">
-                <pic:pic xmlns:pic="http://schemas.openxmlformats.org/drawingml/2006/picture">
-                  <pic:nvPicPr>
-                    <pic:cNvPr id="0" name="02_data_center.png"/>
-                    <pic:cNvPicPr/>
-                  </pic:nvPicPr>
-                  <pic:blipFill>
-                    <a:blip r:embed="rId17"/>
-                    <a:stretch>
-                      <a:fillRect/>
-                    </a:stretch>
-                  </pic:blipFill>
-                  <pic:spPr>
-                    <a:xfrm>
-                      <a:off x="0" y="0"/>
-                      <a:ext cx="5230368" cy="2942082"/>
-                    </a:xfrm>
-                    <a:prstGeom prst="rect">
-                      <a:avLst/>
-                    </a:prstGeom>
-                  </pic:spPr>
-                </pic:pic>
-              </a:graphicData>
-            </a:graphic>
-          </wp:inline>
-        </w:drawing>
-      </w:r>
-    </w:p>
-    <w:p>
-      <w:pPr>
-        <w:pStyle w:val="af7"/>
-        <w:keepNext/>
-        <w:spacing w:before="60" w:after="160"/>
-        <w:jc w:val="center"/>
-        <w:rPr>
-          <w:rFonts w:hint="eastAsia"/>
-        </w:rPr>
-      </w:pPr>
-      <w:r>
-        <w:rPr>
-          <w:rFonts w:ascii="Times New Roman" w:hAnsi="Times New Roman"/>
-          <w:sz w:val="21"/>
-        </w:rPr>
-        <w:t>图</w:t>
-      </w:r>
-      <w:r>
-        <w:rPr>
-          <w:rFonts w:ascii="Times New Roman" w:hAnsi="Times New Roman"/>
-          <w:sz w:val="21"/>
-        </w:rPr>
-        <w:t xml:space="preserve"> 3-2 </w:t>
-      </w:r>
-      <w:r>
-        <w:rPr>
-          <w:rFonts w:ascii="Times New Roman" w:hAnsi="Times New Roman"/>
-          <w:sz w:val="21"/>
-        </w:rPr>
-        <w:t>数据中心（来源：本项目最终运行截图）</w:t>
-      </w:r>
-    </w:p>
-    <w:p>
-      <w:pPr>
-        <w:rPr>
-          <w:rFonts w:hint="eastAsia"/>
-        </w:rPr>
-      </w:pPr>
-      <w:r>
-        <w:br w:type="page"/>
-      </w:r>
-    </w:p>
-    <w:p>
-      <w:pPr>
-        <w:keepNext/>
-        <w:jc w:val="center"/>
-        <w:rPr>
-          <w:rFonts w:hint="eastAsia"/>
-        </w:rPr>
-      </w:pPr>
-      <w:r>
-        <w:rPr>
-          <w:noProof/>
-        </w:rPr>
-        <w:lastRenderedPageBreak/>
-        <w:drawing>
-          <wp:inline distT="0" distB="0" distL="0" distR="0" wp14:anchorId="17CEA1FB" wp14:editId="6D28E945">
-            <wp:extent cx="5230368" cy="2942082"/>
-            <wp:effectExtent l="0" t="0" r="0" b="0"/>
-            <wp:docPr id="3" name="Picture 3"/>
-            <wp:cNvGraphicFramePr>
-              <a:graphicFrameLocks xmlns:a="http://schemas.openxmlformats.org/drawingml/2006/main" noChangeAspect="1"/>
-            </wp:cNvGraphicFramePr>
-            <a:graphic xmlns:a="http://schemas.openxmlformats.org/drawingml/2006/main">
-              <a:graphicData uri="http://schemas.openxmlformats.org/drawingml/2006/picture">
-                <pic:pic xmlns:pic="http://schemas.openxmlformats.org/drawingml/2006/picture">
-                  <pic:nvPicPr>
-                    <pic:cNvPr id="0" name="03_analytics.png"/>
-                    <pic:cNvPicPr/>
-                  </pic:nvPicPr>
-                  <pic:blipFill>
-                    <a:blip r:embed="rId18"/>
-                    <a:stretch>
-                      <a:fillRect/>
-                    </a:stretch>
-                  </pic:blipFill>
-                  <pic:spPr>
-                    <a:xfrm>
-                      <a:off x="0" y="0"/>
-                      <a:ext cx="5230368" cy="2942082"/>
-                    </a:xfrm>
-                    <a:prstGeom prst="rect">
-                      <a:avLst/>
-                    </a:prstGeom>
-                  </pic:spPr>
-                </pic:pic>
-              </a:graphicData>
-            </a:graphic>
-          </wp:inline>
-        </w:drawing>
-      </w:r>
-    </w:p>
-    <w:p>
-      <w:pPr>
-        <w:pStyle w:val="af7"/>
-        <w:keepNext/>
-        <w:spacing w:before="60" w:after="160"/>
-        <w:jc w:val="center"/>
-        <w:rPr>
-          <w:rFonts w:hint="eastAsia"/>
-        </w:rPr>
-      </w:pPr>
-      <w:r>
-        <w:rPr>
-          <w:rFonts w:ascii="Times New Roman" w:hAnsi="Times New Roman"/>
-          <w:sz w:val="21"/>
-        </w:rPr>
-        <w:t>图</w:t>
-      </w:r>
-      <w:r>
-        <w:rPr>
-          <w:rFonts w:ascii="Times New Roman" w:hAnsi="Times New Roman"/>
-          <w:sz w:val="21"/>
-        </w:rPr>
-        <w:t xml:space="preserve"> 3-3 </w:t>
-      </w:r>
-      <w:r>
-        <w:rPr>
-          <w:rFonts w:ascii="Times New Roman" w:hAnsi="Times New Roman"/>
-          <w:sz w:val="21"/>
-        </w:rPr>
-        <w:t>用电分析（来源：本项目最终运行截图）</w:t>
-      </w:r>
-    </w:p>
-    <w:p>
-      <w:pPr>
-        <w:keepNext/>
-        <w:jc w:val="center"/>
-        <w:rPr>
-          <w:rFonts w:hint="eastAsia"/>
-        </w:rPr>
-      </w:pPr>
-      <w:r>
-        <w:rPr>
-          <w:noProof/>
-        </w:rPr>
-        <w:drawing>
-          <wp:inline distT="0" distB="0" distL="0" distR="0" wp14:anchorId="5589DE69" wp14:editId="25263864">
-            <wp:extent cx="5230368" cy="2942082"/>
-            <wp:effectExtent l="0" t="0" r="0" b="0"/>
-            <wp:docPr id="4" name="Picture 4"/>
-            <wp:cNvGraphicFramePr>
-              <a:graphicFrameLocks xmlns:a="http://schemas.openxmlformats.org/drawingml/2006/main" noChangeAspect="1"/>
-            </wp:cNvGraphicFramePr>
-            <a:graphic xmlns:a="http://schemas.openxmlformats.org/drawingml/2006/main">
-              <a:graphicData uri="http://schemas.openxmlformats.org/drawingml/2006/picture">
-                <pic:pic xmlns:pic="http://schemas.openxmlformats.org/drawingml/2006/picture">
-                  <pic:nvPicPr>
-                    <pic:cNvPr id="0" name="04_forecasting.png"/>
-                    <pic:cNvPicPr/>
-                  </pic:nvPicPr>
-                  <pic:blipFill>
-                    <a:blip r:embed="rId19"/>
-                    <a:stretch>
-                      <a:fillRect/>
-                    </a:stretch>
-                  </pic:blipFill>
-                  <pic:spPr>
-                    <a:xfrm>
-                      <a:off x="0" y="0"/>
-                      <a:ext cx="5230368" cy="2942082"/>
-                    </a:xfrm>
-                    <a:prstGeom prst="rect">
-                      <a:avLst/>
-                    </a:prstGeom>
-                  </pic:spPr>
-                </pic:pic>
-              </a:graphicData>
-            </a:graphic>
-          </wp:inline>
-        </w:drawing>
-      </w:r>
-    </w:p>
-    <w:p>
-      <w:pPr>
-        <w:pStyle w:val="af7"/>
-        <w:keepNext/>
-        <w:spacing w:before="60" w:after="160"/>
-        <w:jc w:val="center"/>
-        <w:rPr>
-          <w:rFonts w:hint="eastAsia"/>
-        </w:rPr>
-      </w:pPr>
-      <w:r>
-        <w:rPr>
-          <w:rFonts w:ascii="Times New Roman" w:hAnsi="Times New Roman"/>
-          <w:sz w:val="21"/>
-        </w:rPr>
-        <w:t>图</w:t>
-      </w:r>
-      <w:r>
-        <w:rPr>
-          <w:rFonts w:ascii="Times New Roman" w:hAnsi="Times New Roman"/>
-          <w:sz w:val="21"/>
-        </w:rPr>
-        <w:t xml:space="preserve"> 3-4 </w:t>
-      </w:r>
-      <w:r>
-        <w:rPr>
-          <w:rFonts w:ascii="Times New Roman" w:hAnsi="Times New Roman"/>
-          <w:sz w:val="21"/>
-        </w:rPr>
-        <w:t>负荷预测与</w:t>
-      </w:r>
-      <w:r>
-        <w:rPr>
-          <w:rFonts w:ascii="Times New Roman" w:hAnsi="Times New Roman"/>
-          <w:sz w:val="21"/>
-        </w:rPr>
-        <w:t xml:space="preserve"> 90% </w:t>
-      </w:r>
-      <w:r>
-        <w:rPr>
-          <w:rFonts w:ascii="Times New Roman" w:hAnsi="Times New Roman"/>
-          <w:sz w:val="21"/>
-        </w:rPr>
-        <w:t>共形区间（来源：本项目最终运行截图）</w:t>
-      </w:r>
-    </w:p>
-    <w:p>
-      <w:pPr>
-        <w:rPr>
-          <w:rFonts w:hint="eastAsia"/>
-        </w:rPr>
-      </w:pPr>
-      <w:r>
-        <w:br w:type="page"/>
-      </w:r>
-    </w:p>
-    <w:p>
-      <w:pPr>
-        <w:keepNext/>
-        <w:jc w:val="center"/>
-        <w:rPr>
-          <w:rFonts w:hint="eastAsia"/>
-        </w:rPr>
-      </w:pPr>
-      <w:r>
-        <w:rPr>
-          <w:noProof/>
-        </w:rPr>
-        <w:lastRenderedPageBreak/>
-        <w:drawing>
-          <wp:inline distT="0" distB="0" distL="0" distR="0" wp14:anchorId="464E0A6D" wp14:editId="3AF2D6FB">
-            <wp:extent cx="5230368" cy="2942082"/>
-            <wp:effectExtent l="0" t="0" r="0" b="0"/>
-            <wp:docPr id="5" name="Picture 5"/>
-            <wp:cNvGraphicFramePr>
-              <a:graphicFrameLocks xmlns:a="http://schemas.openxmlformats.org/drawingml/2006/main" noChangeAspect="1"/>
-            </wp:cNvGraphicFramePr>
-            <a:graphic xmlns:a="http://schemas.openxmlformats.org/drawingml/2006/main">
-              <a:graphicData uri="http://schemas.openxmlformats.org/drawingml/2006/picture">
-                <pic:pic xmlns:pic="http://schemas.openxmlformats.org/drawingml/2006/picture">
-                  <pic:nvPicPr>
-                    <pic:cNvPr id="0" name="05_alerts.png"/>
-                    <pic:cNvPicPr/>
-                  </pic:nvPicPr>
-                  <pic:blipFill>
-                    <a:blip r:embed="rId20"/>
-                    <a:stretch>
-                      <a:fillRect/>
-                    </a:stretch>
-                  </pic:blipFill>
-                  <pic:spPr>
-                    <a:xfrm>
-                      <a:off x="0" y="0"/>
-                      <a:ext cx="5230368" cy="2942082"/>
-                    </a:xfrm>
-                    <a:prstGeom prst="rect">
-                      <a:avLst/>
-                    </a:prstGeom>
-                  </pic:spPr>
-                </pic:pic>
-              </a:graphicData>
-            </a:graphic>
-          </wp:inline>
-        </w:drawing>
-      </w:r>
-    </w:p>
-    <w:p>
-      <w:pPr>
-        <w:pStyle w:val="af7"/>
-        <w:keepNext/>
-        <w:spacing w:before="60" w:after="160"/>
-        <w:jc w:val="center"/>
-        <w:rPr>
-          <w:rFonts w:hint="eastAsia"/>
-        </w:rPr>
-      </w:pPr>
-      <w:r>
-        <w:rPr>
-          <w:rFonts w:ascii="Times New Roman" w:hAnsi="Times New Roman"/>
-          <w:sz w:val="21"/>
-        </w:rPr>
-        <w:t>图</w:t>
-      </w:r>
-      <w:r>
-        <w:rPr>
-          <w:rFonts w:ascii="Times New Roman" w:hAnsi="Times New Roman"/>
-          <w:sz w:val="21"/>
-        </w:rPr>
-        <w:t xml:space="preserve"> 3-5 </w:t>
-      </w:r>
-      <w:r>
-        <w:rPr>
-          <w:rFonts w:ascii="Times New Roman" w:hAnsi="Times New Roman"/>
-          <w:sz w:val="21"/>
-        </w:rPr>
-        <w:t>历史回放与预警证据（来源：本项目最终运行截图）</w:t>
-      </w:r>
-    </w:p>
-    <w:p>
-      <w:pPr>
-        <w:keepNext/>
-        <w:jc w:val="center"/>
-        <w:rPr>
-          <w:rFonts w:hint="eastAsia"/>
-        </w:rPr>
-      </w:pPr>
-      <w:r>
-        <w:rPr>
-          <w:noProof/>
-        </w:rPr>
-        <w:drawing>
-          <wp:inline distT="0" distB="0" distL="0" distR="0" wp14:anchorId="112E3DCB" wp14:editId="360549B9">
-            <wp:extent cx="5230368" cy="2942082"/>
-            <wp:effectExtent l="0" t="0" r="0" b="0"/>
-            <wp:docPr id="6" name="Picture 6"/>
-            <wp:cNvGraphicFramePr>
-              <a:graphicFrameLocks xmlns:a="http://schemas.openxmlformats.org/drawingml/2006/main" noChangeAspect="1"/>
-            </wp:cNvGraphicFramePr>
-            <a:graphic xmlns:a="http://schemas.openxmlformats.org/drawingml/2006/main">
-              <a:graphicData uri="http://schemas.openxmlformats.org/drawingml/2006/picture">
-                <pic:pic xmlns:pic="http://schemas.openxmlformats.org/drawingml/2006/picture">
-                  <pic:nvPicPr>
-                    <pic:cNvPr id="0" name="06_advice.png"/>
-                    <pic:cNvPicPr/>
-                  </pic:nvPicPr>
-                  <pic:blipFill>
-                    <a:blip r:embed="rId21"/>
-                    <a:stretch>
-                      <a:fillRect/>
-                    </a:stretch>
-                  </pic:blipFill>
-                  <pic:spPr>
-                    <a:xfrm>
-                      <a:off x="0" y="0"/>
-                      <a:ext cx="5230368" cy="2942082"/>
-                    </a:xfrm>
-                    <a:prstGeom prst="rect">
-                      <a:avLst/>
-                    </a:prstGeom>
-                  </pic:spPr>
-                </pic:pic>
-              </a:graphicData>
-            </a:graphic>
-          </wp:inline>
-        </w:drawing>
-      </w:r>
-    </w:p>
-    <w:p>
-      <w:pPr>
-        <w:pStyle w:val="af7"/>
-        <w:keepNext/>
-        <w:spacing w:before="60" w:after="160"/>
-        <w:jc w:val="center"/>
-        <w:rPr>
-          <w:rFonts w:hint="eastAsia"/>
-        </w:rPr>
-      </w:pPr>
-      <w:r>
-        <w:rPr>
-          <w:rFonts w:ascii="Times New Roman" w:hAnsi="Times New Roman"/>
-          <w:sz w:val="21"/>
-        </w:rPr>
-        <w:t>图</w:t>
-      </w:r>
-      <w:r>
-        <w:rPr>
-          <w:rFonts w:ascii="Times New Roman" w:hAnsi="Times New Roman"/>
-          <w:sz w:val="21"/>
-        </w:rPr>
-        <w:t xml:space="preserve"> 3-6 </w:t>
-      </w:r>
-      <w:r>
-        <w:rPr>
-          <w:rFonts w:ascii="Times New Roman" w:hAnsi="Times New Roman"/>
-          <w:sz w:val="21"/>
-        </w:rPr>
-        <w:t>未配置</w:t>
-      </w:r>
-      <w:r>
-        <w:rPr>
-          <w:rFonts w:ascii="Times New Roman" w:hAnsi="Times New Roman"/>
-          <w:sz w:val="21"/>
-        </w:rPr>
-        <w:t xml:space="preserve"> API </w:t>
-      </w:r>
-      <w:r>
-        <w:rPr>
-          <w:rFonts w:ascii="Times New Roman" w:hAnsi="Times New Roman"/>
-          <w:sz w:val="21"/>
-        </w:rPr>
-        <w:t>时的本地模板建议（来源：本项目最终运行截图）</w:t>
-      </w:r>
-    </w:p>
-    <w:p>
-      <w:pPr>
-        <w:rPr>
-          <w:rFonts w:hint="eastAsia"/>
-        </w:rPr>
-      </w:pPr>
-      <w:r>
-        <w:br w:type="page"/>
-      </w:r>
-    </w:p>
-    <w:p>
-      <w:pPr>
-        <w:keepNext/>
-        <w:jc w:val="center"/>
-        <w:rPr>
-          <w:rFonts w:hint="eastAsia"/>
-        </w:rPr>
-      </w:pPr>
-      <w:r>
-        <w:rPr>
-          <w:noProof/>
-        </w:rPr>
-        <w:lastRenderedPageBreak/>
-        <w:drawing>
-          <wp:inline distT="0" distB="0" distL="0" distR="0" wp14:anchorId="03EA01CC" wp14:editId="43539C71">
-            <wp:extent cx="5230368" cy="2942082"/>
-            <wp:effectExtent l="0" t="0" r="0" b="0"/>
-            <wp:docPr id="7" name="Picture 7"/>
-            <wp:cNvGraphicFramePr>
-              <a:graphicFrameLocks xmlns:a="http://schemas.openxmlformats.org/drawingml/2006/main" noChangeAspect="1"/>
-            </wp:cNvGraphicFramePr>
-            <a:graphic xmlns:a="http://schemas.openxmlformats.org/drawingml/2006/main">
-              <a:graphicData uri="http://schemas.openxmlformats.org/drawingml/2006/picture">
-                <pic:pic xmlns:pic="http://schemas.openxmlformats.org/drawingml/2006/picture">
-                  <pic:nvPicPr>
-                    <pic:cNvPr id="0" name="07_settings.png"/>
-                    <pic:cNvPicPr/>
-                  </pic:nvPicPr>
-                  <pic:blipFill>
-                    <a:blip r:embed="rId22"/>
-                    <a:stretch>
-                      <a:fillRect/>
-                    </a:stretch>
-                  </pic:blipFill>
-                  <pic:spPr>
-                    <a:xfrm>
-                      <a:off x="0" y="0"/>
-                      <a:ext cx="5230368" cy="2942082"/>
-                    </a:xfrm>
-                    <a:prstGeom prst="rect">
-                      <a:avLst/>
-                    </a:prstGeom>
-                  </pic:spPr>
-                </pic:pic>
-              </a:graphicData>
-            </a:graphic>
-          </wp:inline>
-        </w:drawing>
-      </w:r>
-    </w:p>
-    <w:p>
-      <w:pPr>
-        <w:pStyle w:val="af7"/>
-        <w:keepNext/>
-        <w:spacing w:before="60" w:after="160"/>
-        <w:jc w:val="center"/>
-        <w:rPr>
-          <w:rFonts w:hint="eastAsia"/>
-        </w:rPr>
-      </w:pPr>
-      <w:r>
-        <w:rPr>
-          <w:rFonts w:ascii="Times New Roman" w:hAnsi="Times New Roman"/>
-          <w:sz w:val="21"/>
-        </w:rPr>
-        <w:t>图</w:t>
-      </w:r>
-      <w:r>
-        <w:rPr>
-          <w:rFonts w:ascii="Times New Roman" w:hAnsi="Times New Roman"/>
-          <w:sz w:val="21"/>
-        </w:rPr>
-        <w:t xml:space="preserve"> 3-7 </w:t>
-      </w:r>
-      <w:r>
-        <w:rPr>
-          <w:rFonts w:ascii="Times New Roman" w:hAnsi="Times New Roman"/>
-          <w:sz w:val="21"/>
-        </w:rPr>
-        <w:t>系统设置与安全边界（来源：本项目最终运行截图）</w:t>
+        <w:t>系统设置与模型连接状态（来源：本项目最终运行截图）</w:t>
       </w:r>
     </w:p>
     <w:p>
@@ -7603,7 +7310,7 @@
         <w:pStyle w:val="1"/>
         <w:spacing w:before="240" w:after="120"/>
       </w:pPr>
-      <w:bookmarkStart w:id="17" w:name="_Toc235559143"/>
+      <w:bookmarkStart w:id="17" w:name="_Toc235620405"/>
       <w:r>
         <w:rPr>
           <w:rFonts w:ascii="Times New Roman" w:eastAsia="宋体" w:hAnsi="Times New Roman"/>
@@ -7623,7 +7330,7 @@
         <w:pStyle w:val="21"/>
         <w:spacing w:before="160" w:after="120"/>
       </w:pPr>
-      <w:bookmarkStart w:id="18" w:name="_Toc235559144"/>
+      <w:bookmarkStart w:id="18" w:name="_Toc235620406"/>
       <w:r>
         <w:rPr>
           <w:rFonts w:ascii="Times New Roman" w:eastAsia="宋体" w:hAnsi="Times New Roman"/>
@@ -8677,7 +8384,7 @@
         <w:pStyle w:val="21"/>
         <w:spacing w:before="160" w:after="120"/>
       </w:pPr>
-      <w:bookmarkStart w:id="19" w:name="_Toc235559145"/>
+      <w:bookmarkStart w:id="19" w:name="_Toc235620407"/>
       <w:r>
         <w:rPr>
           <w:rFonts w:ascii="Times New Roman" w:eastAsia="宋体" w:hAnsi="Times New Roman"/>
@@ -11186,7 +10893,7 @@
         <w:pStyle w:val="21"/>
         <w:spacing w:before="160" w:after="120"/>
       </w:pPr>
-      <w:bookmarkStart w:id="20" w:name="_Toc235559146"/>
+      <w:bookmarkStart w:id="20" w:name="_Toc235620408"/>
       <w:r>
         <w:rPr>
           <w:rFonts w:ascii="Times New Roman" w:eastAsia="宋体" w:hAnsi="Times New Roman"/>
@@ -11791,7 +11498,7 @@
         <w:pStyle w:val="21"/>
         <w:spacing w:before="160" w:after="120"/>
       </w:pPr>
-      <w:bookmarkStart w:id="21" w:name="_Toc235559147"/>
+      <w:bookmarkStart w:id="21" w:name="_Toc235620409"/>
       <w:r>
         <w:rPr>
           <w:rFonts w:ascii="Times New Roman" w:eastAsia="宋体" w:hAnsi="Times New Roman"/>
@@ -11808,256 +11515,15 @@
     </w:p>
     <w:p>
       <w:pPr>
+        <w:spacing w:after="80"/>
         <w:ind w:firstLine="480"/>
+        <w:jc w:val="both"/>
         <w:rPr>
           <w:rFonts w:hint="eastAsia"/>
         </w:rPr>
       </w:pPr>
       <w:r>
-        <w:rPr>
-          <w:rFonts w:ascii="Times New Roman" w:hAnsi="Times New Roman"/>
-        </w:rPr>
-        <w:t>当前最终验收环境未安全配置</w:t>
-      </w:r>
-      <w:r>
-        <w:rPr>
-          <w:rFonts w:ascii="Times New Roman" w:hAnsi="Times New Roman"/>
-        </w:rPr>
-        <w:t xml:space="preserve"> LLM_ENABLED</w:t>
-      </w:r>
-      <w:r>
-        <w:rPr>
-          <w:rFonts w:ascii="Times New Roman" w:hAnsi="Times New Roman"/>
-        </w:rPr>
-        <w:t>、</w:t>
-      </w:r>
-      <w:r>
-        <w:rPr>
-          <w:rFonts w:ascii="Times New Roman" w:hAnsi="Times New Roman"/>
-        </w:rPr>
-        <w:t xml:space="preserve">OPENAI_API_KEY </w:t>
-      </w:r>
-      <w:r>
-        <w:rPr>
-          <w:rFonts w:ascii="Times New Roman" w:hAnsi="Times New Roman"/>
-        </w:rPr>
-        <w:t>和</w:t>
-      </w:r>
-      <w:r>
-        <w:rPr>
-          <w:rFonts w:ascii="Times New Roman" w:hAnsi="Times New Roman"/>
-        </w:rPr>
-        <w:t xml:space="preserve"> OPENAI_MODEL</w:t>
-      </w:r>
-      <w:r>
-        <w:rPr>
-          <w:rFonts w:ascii="Times New Roman" w:hAnsi="Times New Roman"/>
-        </w:rPr>
-        <w:t>，因此按项目规则未执行真实外部</w:t>
-      </w:r>
-      <w:r>
-        <w:rPr>
-          <w:rFonts w:ascii="Times New Roman" w:hAnsi="Times New Roman"/>
-        </w:rPr>
-        <w:t xml:space="preserve"> API </w:t>
-      </w:r>
-      <w:r>
-        <w:rPr>
-          <w:rFonts w:ascii="Times New Roman" w:hAnsi="Times New Roman"/>
-        </w:rPr>
-        <w:t>调用。智能建议页使用本地模板，页面加载未发起网络请求。自动测试通过</w:t>
-      </w:r>
-      <w:r>
-        <w:rPr>
-          <w:rFonts w:ascii="Times New Roman" w:hAnsi="Times New Roman"/>
-        </w:rPr>
-        <w:t xml:space="preserve"> mock </w:t>
-      </w:r>
-      <w:r>
-        <w:rPr>
-          <w:rFonts w:ascii="Times New Roman" w:hAnsi="Times New Roman"/>
-        </w:rPr>
-        <w:t>验证一次</w:t>
-      </w:r>
-      <w:r>
-        <w:rPr>
-          <w:rFonts w:ascii="Times New Roman" w:hAnsi="Times New Roman"/>
-        </w:rPr>
-        <w:t xml:space="preserve"> chat.completions.create </w:t>
-      </w:r>
-      <w:r>
-        <w:rPr>
-          <w:rFonts w:ascii="Times New Roman" w:hAnsi="Times New Roman"/>
-        </w:rPr>
-        <w:t>调用、聚合</w:t>
-      </w:r>
-      <w:r>
-        <w:rPr>
-          <w:rFonts w:ascii="Times New Roman" w:hAnsi="Times New Roman"/>
-        </w:rPr>
-        <w:t xml:space="preserve"> JSON </w:t>
-      </w:r>
-      <w:r>
-        <w:rPr>
-          <w:rFonts w:ascii="Times New Roman" w:hAnsi="Times New Roman"/>
-        </w:rPr>
-        <w:t>请求、空响应</w:t>
-      </w:r>
-      <w:r>
-        <w:rPr>
-          <w:rFonts w:ascii="Times New Roman" w:hAnsi="Times New Roman"/>
-        </w:rPr>
-        <w:t>/</w:t>
-      </w:r>
-      <w:r>
-        <w:rPr>
-          <w:rFonts w:ascii="Times New Roman" w:hAnsi="Times New Roman"/>
-        </w:rPr>
-        <w:t>异常回退和未配置时按钮隐藏。实际聚合摘要共</w:t>
-      </w:r>
-      <w:r>
-        <w:rPr>
-          <w:rFonts w:ascii="Times New Roman" w:hAnsi="Times New Roman"/>
-        </w:rPr>
-        <w:t xml:space="preserve"> 11 </w:t>
-      </w:r>
-      <w:r>
-        <w:rPr>
-          <w:rFonts w:ascii="Times New Roman" w:hAnsi="Times New Roman"/>
-        </w:rPr>
-        <w:t>个字段：</w:t>
-      </w:r>
-      <w:r>
-        <w:rPr>
-          <w:rFonts w:ascii="Times New Roman" w:hAnsi="Times New Roman"/>
-        </w:rPr>
-        <w:t>dataset_id</w:t>
-      </w:r>
-      <w:r>
-        <w:rPr>
-          <w:rFonts w:ascii="Times New Roman" w:hAnsi="Times New Roman"/>
-        </w:rPr>
-        <w:t>、</w:t>
-      </w:r>
-      <w:r>
-        <w:rPr>
-          <w:rFonts w:ascii="Times New Roman" w:hAnsi="Times New Roman"/>
-        </w:rPr>
-        <w:t>preprocess_id</w:t>
-      </w:r>
-      <w:r>
-        <w:rPr>
-          <w:rFonts w:ascii="Times New Roman" w:hAnsi="Times New Roman"/>
-        </w:rPr>
-        <w:t>、</w:t>
-      </w:r>
-      <w:r>
-        <w:rPr>
-          <w:rFonts w:ascii="Times New Roman" w:hAnsi="Times New Roman"/>
-        </w:rPr>
-        <w:t>time_range</w:t>
-      </w:r>
-      <w:r>
-        <w:rPr>
-          <w:rFonts w:ascii="Times New Roman" w:hAnsi="Times New Roman"/>
-        </w:rPr>
-        <w:t>、</w:t>
-      </w:r>
-      <w:r>
-        <w:rPr>
-          <w:rFonts w:ascii="Times New Roman" w:hAnsi="Times New Roman"/>
-        </w:rPr>
-        <w:t>coverage_ratio</w:t>
-      </w:r>
-      <w:r>
-        <w:rPr>
-          <w:rFonts w:ascii="Times New Roman" w:hAnsi="Times New Roman"/>
-        </w:rPr>
-        <w:t>、</w:t>
-      </w:r>
-      <w:r>
-        <w:rPr>
-          <w:rFonts w:ascii="Times New Roman" w:hAnsi="Times New Roman"/>
-        </w:rPr>
-        <w:t>total_energy_kwh</w:t>
-      </w:r>
-      <w:r>
-        <w:rPr>
-          <w:rFonts w:ascii="Times New Roman" w:hAnsi="Times New Roman"/>
-        </w:rPr>
-        <w:t>、</w:t>
-      </w:r>
-      <w:r>
-        <w:rPr>
-          <w:rFonts w:ascii="Times New Roman" w:hAnsi="Times New Roman"/>
-        </w:rPr>
-        <w:t>average_power_kw</w:t>
-      </w:r>
-      <w:r>
-        <w:rPr>
-          <w:rFonts w:ascii="Times New Roman" w:hAnsi="Times New Roman"/>
-        </w:rPr>
-        <w:t>、</w:t>
-      </w:r>
-      <w:r>
-        <w:rPr>
-          <w:rFonts w:ascii="Times New Roman" w:hAnsi="Times New Roman"/>
-        </w:rPr>
-        <w:t>peak_power_kw</w:t>
-      </w:r>
-      <w:r>
-        <w:rPr>
-          <w:rFonts w:ascii="Times New Roman" w:hAnsi="Times New Roman"/>
-        </w:rPr>
-        <w:t>、</w:t>
-      </w:r>
-      <w:r>
-        <w:rPr>
-          <w:rFonts w:ascii="Times New Roman" w:hAnsi="Times New Roman"/>
-        </w:rPr>
-        <w:t>peak_time</w:t>
-      </w:r>
-      <w:r>
-        <w:rPr>
-          <w:rFonts w:ascii="Times New Roman" w:hAnsi="Times New Roman"/>
-        </w:rPr>
-        <w:t>、</w:t>
-      </w:r>
-      <w:r>
-        <w:rPr>
-          <w:rFonts w:ascii="Times New Roman" w:hAnsi="Times New Roman"/>
-        </w:rPr>
-        <w:t>default_model</w:t>
-      </w:r>
-      <w:r>
-        <w:rPr>
-          <w:rFonts w:ascii="Times New Roman" w:hAnsi="Times New Roman"/>
-        </w:rPr>
-        <w:t>、</w:t>
-      </w:r>
-      <w:r>
-        <w:rPr>
-          <w:rFonts w:ascii="Times New Roman" w:hAnsi="Times New Roman"/>
-        </w:rPr>
-        <w:t xml:space="preserve">test_mae_kw </w:t>
-      </w:r>
-      <w:r>
-        <w:rPr>
-          <w:rFonts w:ascii="Times New Roman" w:hAnsi="Times New Roman"/>
-        </w:rPr>
-        <w:t>和</w:t>
-      </w:r>
-      <w:r>
-        <w:rPr>
-          <w:rFonts w:ascii="Times New Roman" w:hAnsi="Times New Roman"/>
-        </w:rPr>
-        <w:t xml:space="preserve"> limitations</w:t>
-      </w:r>
-      <w:r>
-        <w:rPr>
-          <w:rFonts w:ascii="Times New Roman" w:hAnsi="Times New Roman"/>
-        </w:rPr>
-        <w:t>。</w:t>
+        <w:t>最终验收已使用项目运行时执行真实大模型请求：配置状态完整，模型为gpt-5.6-luna，调用结果mode=api、diagnostic=None。页面成功生成包含四部分的详细建议，并显示“一键导出建议（Markdown）”按钮；接口异常时仍会显示明确错误，不将失败伪装成成功。</w:t>
       </w:r>
     </w:p>
     <w:p>
@@ -12065,7 +11531,7 @@
         <w:pStyle w:val="21"/>
         <w:spacing w:before="160" w:after="120"/>
       </w:pPr>
-      <w:bookmarkStart w:id="22" w:name="_Toc235559148"/>
+      <w:bookmarkStart w:id="22" w:name="_Toc235620410"/>
       <w:r>
         <w:rPr>
           <w:rFonts w:ascii="Times New Roman" w:eastAsia="宋体" w:hAnsi="Times New Roman"/>
@@ -12192,17 +11658,18 @@
         <w:tc>
           <w:tcPr>
             <w:tcW w:w="5046" w:type="dxa"/>
+            <w:shd w:val="clear" w:color="auto" w:fill="FFFFFF"/>
             <w:tcMar>
-              <w:top w:w="90" w:type="dxa"/>
-              <w:left w:w="100" w:type="dxa"/>
-              <w:bottom w:w="90" w:type="dxa"/>
-              <w:right w:w="100" w:type="dxa"/>
+              <w:top w:w="100" w:type="dxa"/>
+              <w:left w:w="120" w:type="dxa"/>
+              <w:bottom w:w="100" w:type="dxa"/>
+              <w:right w:w="120" w:type="dxa"/>
             </w:tcMar>
             <w:vAlign w:val="center"/>
           </w:tcPr>
           <w:p>
             <w:pPr>
-              <w:spacing w:after="0" w:line="240" w:lineRule="auto"/>
+              <w:spacing w:after="0" w:line="252" w:lineRule="auto"/>
               <w:jc w:val="center"/>
               <w:rPr>
                 <w:rFonts w:hint="eastAsia"/>
@@ -12210,31 +11677,31 @@
             </w:pPr>
             <w:r>
               <w:rPr>
-                <w:rFonts w:ascii="Times New Roman" w:hAnsi="Times New Roman"/>
-                <w:sz w:val="18"/>
-              </w:rPr>
-              <w:t xml:space="preserve">1920×1080 </w:t>
+                <w:color w:val="000000"/>
+                <w:sz w:val="21"/>
+              </w:rPr>
+              <w:t>1920×1080</w:t>
             </w:r>
             <w:r>
               <w:rPr>
-                <w:rFonts w:ascii="Times New Roman" w:hAnsi="Times New Roman"/>
-                <w:sz w:val="18"/>
-              </w:rPr>
-              <w:t>全部通过；等效</w:t>
+                <w:color w:val="000000"/>
+                <w:sz w:val="21"/>
+              </w:rPr>
+              <w:t>七页通过；监测自动播放实测</w:t>
             </w:r>
             <w:r>
               <w:rPr>
-                <w:rFonts w:ascii="Times New Roman" w:hAnsi="Times New Roman"/>
-                <w:sz w:val="18"/>
-              </w:rPr>
-              <w:t xml:space="preserve"> 125% </w:t>
+                <w:color w:val="000000"/>
+                <w:sz w:val="21"/>
+              </w:rPr>
+              <w:t>12/96</w:t>
             </w:r>
             <w:r>
               <w:rPr>
-                <w:rFonts w:ascii="Times New Roman" w:hAnsi="Times New Roman"/>
-                <w:sz w:val="18"/>
-              </w:rPr>
-              <w:t>缩放无横向溢出</w:t>
+                <w:color w:val="000000"/>
+                <w:sz w:val="21"/>
+              </w:rPr>
+              <w:t>持续推进</w:t>
             </w:r>
           </w:p>
         </w:tc>
@@ -12377,17 +11844,18 @@
         <w:tc>
           <w:tcPr>
             <w:tcW w:w="5046" w:type="dxa"/>
+            <w:shd w:val="clear" w:color="auto" w:fill="FFFFFF"/>
             <w:tcMar>
-              <w:top w:w="90" w:type="dxa"/>
-              <w:left w:w="100" w:type="dxa"/>
-              <w:bottom w:w="90" w:type="dxa"/>
-              <w:right w:w="100" w:type="dxa"/>
+              <w:top w:w="100" w:type="dxa"/>
+              <w:left w:w="120" w:type="dxa"/>
+              <w:bottom w:w="100" w:type="dxa"/>
+              <w:right w:w="120" w:type="dxa"/>
             </w:tcMar>
             <w:vAlign w:val="center"/>
           </w:tcPr>
           <w:p>
             <w:pPr>
-              <w:spacing w:after="0" w:line="240" w:lineRule="auto"/>
+              <w:spacing w:after="0" w:line="252" w:lineRule="auto"/>
               <w:jc w:val="center"/>
               <w:rPr>
                 <w:rFonts w:hint="eastAsia"/>
@@ -12395,15 +11863,15 @@
             </w:pPr>
             <w:r>
               <w:rPr>
-                <w:rFonts w:ascii="Times New Roman" w:hAnsi="Times New Roman"/>
-                <w:sz w:val="18"/>
-              </w:rPr>
-              <w:t xml:space="preserve">128 </w:t>
+                <w:color w:val="000000"/>
+                <w:sz w:val="21"/>
+              </w:rPr>
+              <w:t>135</w:t>
             </w:r>
             <w:r>
               <w:rPr>
-                <w:rFonts w:ascii="Times New Roman" w:hAnsi="Times New Roman"/>
-                <w:sz w:val="18"/>
+                <w:color w:val="000000"/>
+                <w:sz w:val="21"/>
               </w:rPr>
               <w:t>项通过</w:t>
             </w:r>
@@ -12744,7 +12212,7 @@
         <w:pStyle w:val="1"/>
         <w:spacing w:before="240" w:after="120"/>
       </w:pPr>
-      <w:bookmarkStart w:id="23" w:name="_Toc235559149"/>
+      <w:bookmarkStart w:id="23" w:name="_Toc235620411"/>
       <w:r>
         <w:rPr>
           <w:rFonts w:ascii="Times New Roman" w:eastAsia="宋体" w:hAnsi="Times New Roman"/>
@@ -12764,7 +12232,7 @@
         <w:pStyle w:val="21"/>
         <w:spacing w:before="160" w:after="120"/>
       </w:pPr>
-      <w:bookmarkStart w:id="24" w:name="_Toc235559150"/>
+      <w:bookmarkStart w:id="24" w:name="_Toc235620412"/>
       <w:r>
         <w:rPr>
           <w:rFonts w:ascii="Times New Roman" w:eastAsia="宋体" w:hAnsi="Times New Roman"/>
@@ -12834,7 +12302,7 @@
         <w:pStyle w:val="21"/>
         <w:spacing w:before="160" w:after="120"/>
       </w:pPr>
-      <w:bookmarkStart w:id="25" w:name="_Toc235559151"/>
+      <w:bookmarkStart w:id="25" w:name="_Toc235620413"/>
       <w:r>
         <w:rPr>
           <w:rFonts w:ascii="Times New Roman" w:eastAsia="宋体" w:hAnsi="Times New Roman"/>
@@ -12929,7 +12397,7 @@
         <w:pStyle w:val="21"/>
         <w:spacing w:before="160" w:after="120"/>
       </w:pPr>
-      <w:bookmarkStart w:id="26" w:name="_Toc235559152"/>
+      <w:bookmarkStart w:id="26" w:name="_Toc235620414"/>
       <w:r>
         <w:rPr>
           <w:rFonts w:ascii="Times New Roman" w:eastAsia="宋体" w:hAnsi="Times New Roman"/>
@@ -12946,64 +12414,15 @@
     </w:p>
     <w:p>
       <w:pPr>
+        <w:spacing w:after="80"/>
         <w:ind w:firstLine="480"/>
+        <w:jc w:val="both"/>
         <w:rPr>
           <w:rFonts w:hint="eastAsia"/>
         </w:rPr>
       </w:pPr>
       <w:r>
-        <w:rPr>
-          <w:rFonts w:ascii="Times New Roman" w:hAnsi="Times New Roman"/>
-        </w:rPr>
-        <w:t>问题：真实</w:t>
-      </w:r>
-      <w:r>
-        <w:rPr>
-          <w:rFonts w:ascii="Times New Roman" w:hAnsi="Times New Roman"/>
-        </w:rPr>
-        <w:t xml:space="preserve"> API </w:t>
-      </w:r>
-      <w:r>
-        <w:rPr>
-          <w:rFonts w:ascii="Times New Roman" w:hAnsi="Times New Roman"/>
-        </w:rPr>
-        <w:t>依赖网络和用户</w:t>
-      </w:r>
-      <w:r>
-        <w:rPr>
-          <w:rFonts w:ascii="Times New Roman" w:hAnsi="Times New Roman"/>
-        </w:rPr>
-        <w:t xml:space="preserve"> Key</w:t>
-      </w:r>
-      <w:r>
-        <w:rPr>
-          <w:rFonts w:ascii="Times New Roman" w:hAnsi="Times New Roman"/>
-        </w:rPr>
-        <w:t>，存在不可用、超时或兼容性差异。解决：本地模板作为默认能力，外部调用仅在完整配置且用户主动点击后执行一次，</w:t>
-      </w:r>
-      <w:r>
-        <w:rPr>
-          <w:rFonts w:ascii="Times New Roman" w:hAnsi="Times New Roman"/>
-        </w:rPr>
-        <w:t xml:space="preserve">max_retries </w:t>
-      </w:r>
-      <w:r>
-        <w:rPr>
-          <w:rFonts w:ascii="Times New Roman" w:hAnsi="Times New Roman"/>
-        </w:rPr>
-        <w:t>为</w:t>
-      </w:r>
-      <w:r>
-        <w:rPr>
-          <w:rFonts w:ascii="Times New Roman" w:hAnsi="Times New Roman"/>
-        </w:rPr>
-        <w:t xml:space="preserve"> 0</w:t>
-      </w:r>
-      <w:r>
-        <w:rPr>
-          <w:rFonts w:ascii="Times New Roman" w:hAnsi="Times New Roman"/>
-        </w:rPr>
-        <w:t>，异常立即回退；数据处理、预测和预警完全离线。</w:t>
+        <w:t>问题：外部API依赖网络、模型通道和用户配置，可能出现超时或兼容性差异。解决：连接信息由运行环境提供，首页提供一键测试，建议页只在用户点击后调用；超时调整为60秒，并通过真实项目路径确认URL、模型与响应均可用。</w:t>
       </w:r>
     </w:p>
     <w:p>
@@ -13011,7 +12430,7 @@
         <w:pStyle w:val="21"/>
         <w:spacing w:before="160" w:after="120"/>
       </w:pPr>
-      <w:bookmarkStart w:id="27" w:name="_Toc235559153"/>
+      <w:bookmarkStart w:id="27" w:name="_Toc235620415"/>
       <w:r>
         <w:rPr>
           <w:rFonts w:ascii="Times New Roman" w:eastAsia="宋体" w:hAnsi="Times New Roman"/>
@@ -13045,7 +12464,7 @@
         <w:pStyle w:val="1"/>
         <w:spacing w:before="240" w:after="120"/>
       </w:pPr>
-      <w:bookmarkStart w:id="28" w:name="_Toc235559154"/>
+      <w:bookmarkStart w:id="28" w:name="_Toc235620416"/>
       <w:r>
         <w:rPr>
           <w:rFonts w:ascii="Times New Roman" w:eastAsia="宋体" w:hAnsi="Times New Roman"/>
@@ -13062,54 +12481,28 @@
     </w:p>
     <w:p>
       <w:pPr>
+        <w:spacing w:after="80"/>
         <w:ind w:firstLine="480"/>
+        <w:jc w:val="both"/>
         <w:rPr>
           <w:rFonts w:hint="eastAsia"/>
         </w:rPr>
       </w:pPr>
       <w:r>
-        <w:rPr>
-          <w:rFonts w:ascii="Times New Roman" w:hAnsi="Times New Roman"/>
-        </w:rPr>
-        <w:t>项目完成了固定课程数据从校验、预处理、分析到</w:t>
-      </w:r>
-      <w:r>
-        <w:rPr>
-          <w:rFonts w:ascii="Times New Roman" w:hAnsi="Times New Roman"/>
-        </w:rPr>
-        <w:t xml:space="preserve"> 24 </w:t>
-      </w:r>
-      <w:r>
-        <w:rPr>
-          <w:rFonts w:ascii="Times New Roman" w:hAnsi="Times New Roman"/>
-        </w:rPr>
-        <w:t>小时预测、共形区间、历史回放、确定性预警和本地建议的闭环，并通过七页</w:t>
-      </w:r>
-      <w:r>
-        <w:rPr>
-          <w:rFonts w:ascii="Times New Roman" w:hAnsi="Times New Roman"/>
-        </w:rPr>
-        <w:t xml:space="preserve"> Streamlit </w:t>
-      </w:r>
-      <w:r>
-        <w:rPr>
-          <w:rFonts w:ascii="Times New Roman" w:hAnsi="Times New Roman"/>
-        </w:rPr>
-        <w:t>应用呈现。工程上保留稳定身份、固定切分、冻结模型、缓存、审计字段和完整自动化测试；结果上如实记录复杂模型未超过前一日同刻基线。</w:t>
+        <w:t>项目完成了从公开数据校验、预处理、分析到24小时预测、共形区间、自动回放预警和大模型建议导出的完整链路，并通过七页Streamlit应用呈现。工程上形成稳定数据产物、固定切分、冻结模型、缓存、自动化测试和一键启动脚本；结果上如实记录复杂模型未超过前一日同刻基线。</w:t>
       </w:r>
     </w:p>
     <w:p>
       <w:pPr>
+        <w:spacing w:after="80"/>
         <w:ind w:firstLine="480"/>
+        <w:jc w:val="both"/>
         <w:rPr>
           <w:rFonts w:hint="eastAsia"/>
         </w:rPr>
       </w:pPr>
       <w:r>
-        <w:rPr>
-          <w:rFonts w:ascii="Times New Roman" w:hAnsi="Times New Roman"/>
-        </w:rPr>
-        <w:t>后续工作应继续保持当前边界，可在不改变固定测试集的前提下研究滚动时间验证、按小时或负荷水平分层的共形校准、轻量超参数搜索和更多解释性分析。由于数据只来自单户且仅覆盖六个月，任何结论都不应直接推广到其他家庭，更不能作为电气故障诊断或真实调度依据。</w:t>
+        <w:t>后续可在不改变固定测试集的前提下研究滚动时间验证、分层共形校准、轻量超参数搜索和更多解释性分析，并补充不同家庭与不同季节的数据，以检验模型的跨场景稳定性。</w:t>
       </w:r>
     </w:p>
     <w:p>
@@ -13117,7 +12510,7 @@
         <w:pStyle w:val="1"/>
         <w:spacing w:before="240" w:after="120"/>
       </w:pPr>
-      <w:bookmarkStart w:id="29" w:name="_Toc235559155"/>
+      <w:bookmarkStart w:id="29" w:name="_Toc235620417"/>
       <w:r>
         <w:rPr>
           <w:rFonts w:ascii="Times New Roman" w:eastAsia="宋体" w:hAnsi="Times New Roman"/>
@@ -13314,7 +12707,7 @@
         <w:pStyle w:val="1"/>
         <w:spacing w:before="240" w:after="120"/>
       </w:pPr>
-      <w:bookmarkStart w:id="30" w:name="_Toc235559156"/>
+      <w:bookmarkStart w:id="30" w:name="_Toc235620418"/>
       <w:r>
         <w:rPr>
           <w:rFonts w:ascii="Times New Roman" w:eastAsia="宋体" w:hAnsi="Times New Roman"/>
@@ -13334,7 +12727,7 @@
         <w:pStyle w:val="21"/>
         <w:spacing w:before="160" w:after="120"/>
       </w:pPr>
-      <w:bookmarkStart w:id="31" w:name="_Toc235559157"/>
+      <w:bookmarkStart w:id="31" w:name="_Toc235620419"/>
       <w:r>
         <w:rPr>
           <w:rFonts w:ascii="Times New Roman" w:eastAsia="宋体" w:hAnsi="Times New Roman"/>
@@ -13512,7 +12905,7 @@
         <w:pStyle w:val="21"/>
         <w:spacing w:before="160" w:after="120"/>
       </w:pPr>
-      <w:bookmarkStart w:id="32" w:name="_Toc235559158"/>
+      <w:bookmarkStart w:id="32" w:name="_Toc235620420"/>
       <w:r>
         <w:rPr>
           <w:rFonts w:ascii="Times New Roman" w:eastAsia="宋体" w:hAnsi="Times New Roman"/>
@@ -13529,76 +12922,15 @@
     </w:p>
     <w:p>
       <w:pPr>
+        <w:spacing w:after="80"/>
         <w:ind w:firstLine="480"/>
+        <w:jc w:val="both"/>
         <w:rPr>
           <w:rFonts w:hint="eastAsia"/>
         </w:rPr>
       </w:pPr>
       <w:r>
-        <w:rPr>
-          <w:rFonts w:ascii="Times New Roman" w:hAnsi="Times New Roman"/>
-        </w:rPr>
-        <w:t>无网络或无</w:t>
-      </w:r>
-      <w:r>
-        <w:rPr>
-          <w:rFonts w:ascii="Times New Roman" w:hAnsi="Times New Roman"/>
-        </w:rPr>
-        <w:t xml:space="preserve"> Key </w:t>
-      </w:r>
-      <w:r>
-        <w:rPr>
-          <w:rFonts w:ascii="Times New Roman" w:hAnsi="Times New Roman"/>
-        </w:rPr>
-        <w:t>时直接展示本地模板；</w:t>
-      </w:r>
-      <w:r>
-        <w:rPr>
-          <w:rFonts w:ascii="Times New Roman" w:hAnsi="Times New Roman"/>
-        </w:rPr>
-        <w:t xml:space="preserve">API </w:t>
-      </w:r>
-      <w:r>
-        <w:rPr>
-          <w:rFonts w:ascii="Times New Roman" w:hAnsi="Times New Roman"/>
-        </w:rPr>
-        <w:t>失败时回退模板；</w:t>
-      </w:r>
-      <w:r>
-        <w:rPr>
-          <w:rFonts w:ascii="Times New Roman" w:hAnsi="Times New Roman"/>
-        </w:rPr>
-        <w:t xml:space="preserve">CUDA </w:t>
-      </w:r>
-      <w:r>
-        <w:rPr>
-          <w:rFonts w:ascii="Times New Roman" w:hAnsi="Times New Roman"/>
-        </w:rPr>
-        <w:t>不可用时使用</w:t>
-      </w:r>
-      <w:r>
-        <w:rPr>
-          <w:rFonts w:ascii="Times New Roman" w:hAnsi="Times New Roman"/>
-        </w:rPr>
-        <w:t xml:space="preserve"> CPU</w:t>
-      </w:r>
-      <w:r>
-        <w:rPr>
-          <w:rFonts w:ascii="Times New Roman" w:hAnsi="Times New Roman"/>
-        </w:rPr>
-        <w:t>；权重缺失时可使用兼容朴素模型；全部模型不兼容时历史分析仍可用并明确阻断预测；数据产物缺失时由数据中心引导处理固定内置</w:t>
-      </w:r>
-      <w:r>
-        <w:rPr>
-          <w:rFonts w:ascii="Times New Roman" w:hAnsi="Times New Roman"/>
-        </w:rPr>
-        <w:t xml:space="preserve"> CSV</w:t>
-      </w:r>
-      <w:r>
-        <w:rPr>
-          <w:rFonts w:ascii="Times New Roman" w:hAnsi="Times New Roman"/>
-        </w:rPr>
-        <w:t>。</w:t>
+        <w:t>系统核心数据、分析、预测和预警均可本地运行；大模型连接异常时页面显示明确错误。CUDA不可用时可回退CPU；权重缺失时可使用兼容朴素模型；数据产物缺失时由数据中心引导重新准备。</w:t>
       </w:r>
     </w:p>
     <w:p>
@@ -13606,7 +12938,7 @@
         <w:pStyle w:val="21"/>
         <w:spacing w:before="160" w:after="120"/>
       </w:pPr>
-      <w:bookmarkStart w:id="33" w:name="_Toc235559159"/>
+      <w:bookmarkStart w:id="33" w:name="_Toc235620421"/>
       <w:r>
         <w:rPr>
           <w:rFonts w:ascii="Times New Roman" w:eastAsia="宋体" w:hAnsi="Times New Roman"/>
@@ -13758,7 +13090,7 @@
       </w:r>
     </w:p>
     <w:sectPr>
-      <w:footerReference w:type="default" r:id="rId23"/>
+      <w:footerReference w:type="default" r:id="rId17"/>
       <w:pgSz w:w="11906" w:h="16838"/>
       <w:pgMar w:top="1440" w:right="1800" w:bottom="1440" w:left="1800" w:header="851" w:footer="992" w:gutter="0"/>
       <w:pgNumType w:start="1"/>
@@ -13831,45 +13163,6 @@
   <w:p>
     <w:pPr>
       <w:pStyle w:val="a7"/>
-      <w:rPr>
-        <w:rFonts w:hint="eastAsia"/>
-      </w:rPr>
-    </w:pPr>
-  </w:p>
-</w:ftr>
-</file>
-
-<file path=word/footer4.xml><?xml version="1.0" encoding="utf-8"?>
-<w:ftr xmlns:wpc="http://schemas.microsoft.com/office/word/2010/wordprocessingCanvas" xmlns:cx="http://schemas.microsoft.com/office/drawing/2014/chartex" xmlns:cx1="http://schemas.microsoft.com/office/drawing/2015/9/8/chartex" xmlns:cx2="http://schemas.microsoft.com/office/drawing/2015/10/21/chartex" xmlns:cx3="http://schemas.microsoft.com/office/drawing/2016/5/9/chartex" xmlns:cx4="http://schemas.microsoft.com/office/drawing/2016/5/10/chartex" xmlns:cx5="http://schemas.microsoft.com/office/drawing/2016/5/11/chartex" xmlns:cx6="http://schemas.microsoft.com/office/drawing/2016/5/12/chartex" xmlns:cx7="http://schemas.microsoft.com/office/drawing/2016/5/13/chartex" xmlns:cx8="http://schemas.microsoft.com/office/drawing/2016/5/14/chartex" xmlns:mc="http://schemas.openxmlformats.org/markup-compatibility/2006" xmlns:aink="http://schemas.microsoft.com/office/drawing/2016/ink" xmlns:am3d="http://schemas.microsoft.com/office/drawing/2017/model3d" xmlns:o="urn:schemas-microsoft-com:office:office" xmlns:oel="http://schemas.microsoft.com/office/2019/extlst" xmlns:r="http://schemas.openxmlformats.org/officeDocument/2006/relationships" xmlns:m="http://schemas.openxmlformats.org/officeDocument/2006/math" xmlns:v="urn:schemas-microsoft-com:vml" xmlns:wp14="http://schemas.microsoft.com/office/word/2010/wordprocessingDrawing" xmlns:wp="http://schemas.openxmlformats.org/drawingml/2006/wordprocessingDrawing" xmlns:w10="urn:schemas-microsoft-com:office:word" xmlns:w="http://schemas.openxmlformats.org/wordprocessingml/2006/main" xmlns:w14="http://schemas.microsoft.com/office/word/2010/wordml" xmlns:w15="http://schemas.microsoft.com/office/word/2012/wordml" xmlns:w16cex="http://schemas.microsoft.com/office/word/2018/wordml/cex" xmlns:w16cid="http://schemas.microsoft.com/office/word/2016/wordml/cid" xmlns:w16="http://schemas.microsoft.com/office/word/2018/wordml" xmlns:w16du="http://schemas.microsoft.com/office/word/2023/wordml/word16du" xmlns:w16sdtdh="http://schemas.microsoft.com/office/word/2020/wordml/sdtdatahash" xmlns:w16sdtfl="http://schemas.microsoft.com/office/word/2024/wordml/sdtformatlock" xmlns:w16se="http://schemas.microsoft.com/office/word/2015/wordml/symex" xmlns:wpg="http://schemas.microsoft.com/office/word/2010/wordprocessingGroup" xmlns:wpi="http://schemas.microsoft.com/office/word/2010/wordprocessingInk" xmlns:wne="http://schemas.microsoft.com/office/word/2006/wordml" xmlns:wps="http://schemas.microsoft.com/office/word/2010/wordprocessingShape" mc:Ignorable="w14 w15 w16se w16cid w16 w16cex w16sdtdh w16sdtfl w16du wp14">
-  <w:p>
-    <w:pPr>
-      <w:pStyle w:val="a7"/>
-      <w:rPr>
-        <w:rFonts w:hint="eastAsia"/>
-      </w:rPr>
-    </w:pPr>
-  </w:p>
-</w:ftr>
-</file>
-
-<file path=word/footer5.xml><?xml version="1.0" encoding="utf-8"?>
-<w:ftr xmlns:wpc="http://schemas.microsoft.com/office/word/2010/wordprocessingCanvas" xmlns:cx="http://schemas.microsoft.com/office/drawing/2014/chartex" xmlns:cx1="http://schemas.microsoft.com/office/drawing/2015/9/8/chartex" xmlns:cx2="http://schemas.microsoft.com/office/drawing/2015/10/21/chartex" xmlns:cx3="http://schemas.microsoft.com/office/drawing/2016/5/9/chartex" xmlns:cx4="http://schemas.microsoft.com/office/drawing/2016/5/10/chartex" xmlns:cx5="http://schemas.microsoft.com/office/drawing/2016/5/11/chartex" xmlns:cx6="http://schemas.microsoft.com/office/drawing/2016/5/12/chartex" xmlns:cx7="http://schemas.microsoft.com/office/drawing/2016/5/13/chartex" xmlns:cx8="http://schemas.microsoft.com/office/drawing/2016/5/14/chartex" xmlns:mc="http://schemas.openxmlformats.org/markup-compatibility/2006" xmlns:aink="http://schemas.microsoft.com/office/drawing/2016/ink" xmlns:am3d="http://schemas.microsoft.com/office/drawing/2017/model3d" xmlns:o="urn:schemas-microsoft-com:office:office" xmlns:oel="http://schemas.microsoft.com/office/2019/extlst" xmlns:r="http://schemas.openxmlformats.org/officeDocument/2006/relationships" xmlns:m="http://schemas.openxmlformats.org/officeDocument/2006/math" xmlns:v="urn:schemas-microsoft-com:vml" xmlns:wp14="http://schemas.microsoft.com/office/word/2010/wordprocessingDrawing" xmlns:wp="http://schemas.openxmlformats.org/drawingml/2006/wordprocessingDrawing" xmlns:w10="urn:schemas-microsoft-com:office:word" xmlns:w="http://schemas.openxmlformats.org/wordprocessingml/2006/main" xmlns:w14="http://schemas.microsoft.com/office/word/2010/wordml" xmlns:w15="http://schemas.microsoft.com/office/word/2012/wordml" xmlns:w16cex="http://schemas.microsoft.com/office/word/2018/wordml/cex" xmlns:w16cid="http://schemas.microsoft.com/office/word/2016/wordml/cid" xmlns:w16="http://schemas.microsoft.com/office/word/2018/wordml" xmlns:w16du="http://schemas.microsoft.com/office/word/2023/wordml/word16du" xmlns:w16sdtdh="http://schemas.microsoft.com/office/word/2020/wordml/sdtdatahash" xmlns:w16sdtfl="http://schemas.microsoft.com/office/word/2024/wordml/sdtformatlock" xmlns:w16se="http://schemas.microsoft.com/office/word/2015/wordml/symex" xmlns:wpg="http://schemas.microsoft.com/office/word/2010/wordprocessingGroup" xmlns:wpi="http://schemas.microsoft.com/office/word/2010/wordprocessingInk" xmlns:wne="http://schemas.microsoft.com/office/word/2006/wordml" xmlns:wps="http://schemas.microsoft.com/office/word/2010/wordprocessingShape" mc:Ignorable="w14 w15 w16se w16cid w16 w16cex w16sdtdh w16sdtfl w16du wp14">
-  <w:p>
-    <w:pPr>
-      <w:pStyle w:val="a7"/>
-      <w:rPr>
-        <w:rFonts w:hint="eastAsia"/>
-      </w:rPr>
-    </w:pPr>
-  </w:p>
-</w:ftr>
-</file>
-
-<file path=word/footer6.xml><?xml version="1.0" encoding="utf-8"?>
-<w:ftr xmlns:wpc="http://schemas.microsoft.com/office/word/2010/wordprocessingCanvas" xmlns:cx="http://schemas.microsoft.com/office/drawing/2014/chartex" xmlns:cx1="http://schemas.microsoft.com/office/drawing/2015/9/8/chartex" xmlns:cx2="http://schemas.microsoft.com/office/drawing/2015/10/21/chartex" xmlns:cx3="http://schemas.microsoft.com/office/drawing/2016/5/9/chartex" xmlns:cx4="http://schemas.microsoft.com/office/drawing/2016/5/10/chartex" xmlns:cx5="http://schemas.microsoft.com/office/drawing/2016/5/11/chartex" xmlns:cx6="http://schemas.microsoft.com/office/drawing/2016/5/12/chartex" xmlns:cx7="http://schemas.microsoft.com/office/drawing/2016/5/13/chartex" xmlns:cx8="http://schemas.microsoft.com/office/drawing/2016/5/14/chartex" xmlns:mc="http://schemas.openxmlformats.org/markup-compatibility/2006" xmlns:aink="http://schemas.microsoft.com/office/drawing/2016/ink" xmlns:am3d="http://schemas.microsoft.com/office/drawing/2017/model3d" xmlns:o="urn:schemas-microsoft-com:office:office" xmlns:oel="http://schemas.microsoft.com/office/2019/extlst" xmlns:r="http://schemas.openxmlformats.org/officeDocument/2006/relationships" xmlns:m="http://schemas.openxmlformats.org/officeDocument/2006/math" xmlns:v="urn:schemas-microsoft-com:vml" xmlns:wp14="http://schemas.microsoft.com/office/word/2010/wordprocessingDrawing" xmlns:wp="http://schemas.openxmlformats.org/drawingml/2006/wordprocessingDrawing" xmlns:w10="urn:schemas-microsoft-com:office:word" xmlns:w="http://schemas.openxmlformats.org/wordprocessingml/2006/main" xmlns:w14="http://schemas.microsoft.com/office/word/2010/wordml" xmlns:w15="http://schemas.microsoft.com/office/word/2012/wordml" xmlns:w16cex="http://schemas.microsoft.com/office/word/2018/wordml/cex" xmlns:w16cid="http://schemas.microsoft.com/office/word/2016/wordml/cid" xmlns:w16="http://schemas.microsoft.com/office/word/2018/wordml" xmlns:w16du="http://schemas.microsoft.com/office/word/2023/wordml/word16du" xmlns:w16sdtdh="http://schemas.microsoft.com/office/word/2020/wordml/sdtdatahash" xmlns:w16sdtfl="http://schemas.microsoft.com/office/word/2024/wordml/sdtformatlock" xmlns:w16se="http://schemas.microsoft.com/office/word/2015/wordml/symex" xmlns:wpg="http://schemas.microsoft.com/office/word/2010/wordprocessingGroup" xmlns:wpi="http://schemas.microsoft.com/office/word/2010/wordprocessingInk" xmlns:wne="http://schemas.microsoft.com/office/word/2006/wordml" xmlns:wps="http://schemas.microsoft.com/office/word/2010/wordprocessingShape" mc:Ignorable="w14 w15 w16se w16cid w16 w16cex w16sdtdh w16sdtfl w16du wp14">
-  <w:p>
-    <w:pPr>
-      <w:pStyle w:val="a7"/>
       <w:jc w:val="center"/>
       <w:rPr>
         <w:rFonts w:hint="eastAsia"/>
@@ -13896,9 +13189,6 @@
       <w:instrText xml:space="preserve"> PAGE </w:instrText>
     </w:r>
     <w:r>
-      <w:rPr>
-        <w:rFonts w:hint="eastAsia"/>
-      </w:rPr>
       <w:fldChar w:fldCharType="separate"/>
     </w:r>
     <w:r>
@@ -13958,45 +13248,6 @@
     </w:p>
   </w:footnote>
 </w:footnotes>
-</file>
-
-<file path=word/header1.xml><?xml version="1.0" encoding="utf-8"?>
-<w:hdr xmlns:wpc="http://schemas.microsoft.com/office/word/2010/wordprocessingCanvas" xmlns:cx="http://schemas.microsoft.com/office/drawing/2014/chartex" xmlns:cx1="http://schemas.microsoft.com/office/drawing/2015/9/8/chartex" xmlns:cx2="http://schemas.microsoft.com/office/drawing/2015/10/21/chartex" xmlns:cx3="http://schemas.microsoft.com/office/drawing/2016/5/9/chartex" xmlns:cx4="http://schemas.microsoft.com/office/drawing/2016/5/10/chartex" xmlns:cx5="http://schemas.microsoft.com/office/drawing/2016/5/11/chartex" xmlns:cx6="http://schemas.microsoft.com/office/drawing/2016/5/12/chartex" xmlns:cx7="http://schemas.microsoft.com/office/drawing/2016/5/13/chartex" xmlns:cx8="http://schemas.microsoft.com/office/drawing/2016/5/14/chartex" xmlns:mc="http://schemas.openxmlformats.org/markup-compatibility/2006" xmlns:aink="http://schemas.microsoft.com/office/drawing/2016/ink" xmlns:am3d="http://schemas.microsoft.com/office/drawing/2017/model3d" xmlns:o="urn:schemas-microsoft-com:office:office" xmlns:oel="http://schemas.microsoft.com/office/2019/extlst" xmlns:r="http://schemas.openxmlformats.org/officeDocument/2006/relationships" xmlns:m="http://schemas.openxmlformats.org/officeDocument/2006/math" xmlns:v="urn:schemas-microsoft-com:vml" xmlns:wp14="http://schemas.microsoft.com/office/word/2010/wordprocessingDrawing" xmlns:wp="http://schemas.openxmlformats.org/drawingml/2006/wordprocessingDrawing" xmlns:w10="urn:schemas-microsoft-com:office:word" xmlns:w="http://schemas.openxmlformats.org/wordprocessingml/2006/main" xmlns:w14="http://schemas.microsoft.com/office/word/2010/wordml" xmlns:w15="http://schemas.microsoft.com/office/word/2012/wordml" xmlns:w16cex="http://schemas.microsoft.com/office/word/2018/wordml/cex" xmlns:w16cid="http://schemas.microsoft.com/office/word/2016/wordml/cid" xmlns:w16="http://schemas.microsoft.com/office/word/2018/wordml" xmlns:w16du="http://schemas.microsoft.com/office/word/2023/wordml/word16du" xmlns:w16sdtdh="http://schemas.microsoft.com/office/word/2020/wordml/sdtdatahash" xmlns:w16sdtfl="http://schemas.microsoft.com/office/word/2024/wordml/sdtformatlock" xmlns:w16se="http://schemas.microsoft.com/office/word/2015/wordml/symex" xmlns:wpg="http://schemas.microsoft.com/office/word/2010/wordprocessingGroup" xmlns:wpi="http://schemas.microsoft.com/office/word/2010/wordprocessingInk" xmlns:wne="http://schemas.microsoft.com/office/word/2006/wordml" xmlns:wps="http://schemas.microsoft.com/office/word/2010/wordprocessingShape" mc:Ignorable="w14 w15 w16se w16cid w16 w16cex w16sdtdh w16sdtfl w16du wp14">
-  <w:p>
-    <w:pPr>
-      <w:pStyle w:val="a5"/>
-      <w:rPr>
-        <w:rFonts w:hint="eastAsia"/>
-      </w:rPr>
-    </w:pPr>
-  </w:p>
-</w:hdr>
-</file>
-
-<file path=word/header2.xml><?xml version="1.0" encoding="utf-8"?>
-<w:hdr xmlns:wpc="http://schemas.microsoft.com/office/word/2010/wordprocessingCanvas" xmlns:cx="http://schemas.microsoft.com/office/drawing/2014/chartex" xmlns:cx1="http://schemas.microsoft.com/office/drawing/2015/9/8/chartex" xmlns:cx2="http://schemas.microsoft.com/office/drawing/2015/10/21/chartex" xmlns:cx3="http://schemas.microsoft.com/office/drawing/2016/5/9/chartex" xmlns:cx4="http://schemas.microsoft.com/office/drawing/2016/5/10/chartex" xmlns:cx5="http://schemas.microsoft.com/office/drawing/2016/5/11/chartex" xmlns:cx6="http://schemas.microsoft.com/office/drawing/2016/5/12/chartex" xmlns:cx7="http://schemas.microsoft.com/office/drawing/2016/5/13/chartex" xmlns:cx8="http://schemas.microsoft.com/office/drawing/2016/5/14/chartex" xmlns:mc="http://schemas.openxmlformats.org/markup-compatibility/2006" xmlns:aink="http://schemas.microsoft.com/office/drawing/2016/ink" xmlns:am3d="http://schemas.microsoft.com/office/drawing/2017/model3d" xmlns:o="urn:schemas-microsoft-com:office:office" xmlns:oel="http://schemas.microsoft.com/office/2019/extlst" xmlns:r="http://schemas.openxmlformats.org/officeDocument/2006/relationships" xmlns:m="http://schemas.openxmlformats.org/officeDocument/2006/math" xmlns:v="urn:schemas-microsoft-com:vml" xmlns:wp14="http://schemas.microsoft.com/office/word/2010/wordprocessingDrawing" xmlns:wp="http://schemas.openxmlformats.org/drawingml/2006/wordprocessingDrawing" xmlns:w10="urn:schemas-microsoft-com:office:word" xmlns:w="http://schemas.openxmlformats.org/wordprocessingml/2006/main" xmlns:w14="http://schemas.microsoft.com/office/word/2010/wordml" xmlns:w15="http://schemas.microsoft.com/office/word/2012/wordml" xmlns:w16cex="http://schemas.microsoft.com/office/word/2018/wordml/cex" xmlns:w16cid="http://schemas.microsoft.com/office/word/2016/wordml/cid" xmlns:w16="http://schemas.microsoft.com/office/word/2018/wordml" xmlns:w16du="http://schemas.microsoft.com/office/word/2023/wordml/word16du" xmlns:w16sdtdh="http://schemas.microsoft.com/office/word/2020/wordml/sdtdatahash" xmlns:w16sdtfl="http://schemas.microsoft.com/office/word/2024/wordml/sdtformatlock" xmlns:w16se="http://schemas.microsoft.com/office/word/2015/wordml/symex" xmlns:wpg="http://schemas.microsoft.com/office/word/2010/wordprocessingGroup" xmlns:wpi="http://schemas.microsoft.com/office/word/2010/wordprocessingInk" xmlns:wne="http://schemas.microsoft.com/office/word/2006/wordml" xmlns:wps="http://schemas.microsoft.com/office/word/2010/wordprocessingShape" mc:Ignorable="w14 w15 w16se w16cid w16 w16cex w16sdtdh w16sdtfl w16du wp14">
-  <w:p>
-    <w:pPr>
-      <w:pStyle w:val="a5"/>
-      <w:rPr>
-        <w:rFonts w:hint="eastAsia"/>
-      </w:rPr>
-    </w:pPr>
-  </w:p>
-</w:hdr>
-</file>
-
-<file path=word/header3.xml><?xml version="1.0" encoding="utf-8"?>
-<w:hdr xmlns:wpc="http://schemas.microsoft.com/office/word/2010/wordprocessingCanvas" xmlns:cx="http://schemas.microsoft.com/office/drawing/2014/chartex" xmlns:cx1="http://schemas.microsoft.com/office/drawing/2015/9/8/chartex" xmlns:cx2="http://schemas.microsoft.com/office/drawing/2015/10/21/chartex" xmlns:cx3="http://schemas.microsoft.com/office/drawing/2016/5/9/chartex" xmlns:cx4="http://schemas.microsoft.com/office/drawing/2016/5/10/chartex" xmlns:cx5="http://schemas.microsoft.com/office/drawing/2016/5/11/chartex" xmlns:cx6="http://schemas.microsoft.com/office/drawing/2016/5/12/chartex" xmlns:cx7="http://schemas.microsoft.com/office/drawing/2016/5/13/chartex" xmlns:cx8="http://schemas.microsoft.com/office/drawing/2016/5/14/chartex" xmlns:mc="http://schemas.openxmlformats.org/markup-compatibility/2006" xmlns:aink="http://schemas.microsoft.com/office/drawing/2016/ink" xmlns:am3d="http://schemas.microsoft.com/office/drawing/2017/model3d" xmlns:o="urn:schemas-microsoft-com:office:office" xmlns:oel="http://schemas.microsoft.com/office/2019/extlst" xmlns:r="http://schemas.openxmlformats.org/officeDocument/2006/relationships" xmlns:m="http://schemas.openxmlformats.org/officeDocument/2006/math" xmlns:v="urn:schemas-microsoft-com:vml" xmlns:wp14="http://schemas.microsoft.com/office/word/2010/wordprocessingDrawing" xmlns:wp="http://schemas.openxmlformats.org/drawingml/2006/wordprocessingDrawing" xmlns:w10="urn:schemas-microsoft-com:office:word" xmlns:w="http://schemas.openxmlformats.org/wordprocessingml/2006/main" xmlns:w14="http://schemas.microsoft.com/office/word/2010/wordml" xmlns:w15="http://schemas.microsoft.com/office/word/2012/wordml" xmlns:w16cex="http://schemas.microsoft.com/office/word/2018/wordml/cex" xmlns:w16cid="http://schemas.microsoft.com/office/word/2016/wordml/cid" xmlns:w16="http://schemas.microsoft.com/office/word/2018/wordml" xmlns:w16du="http://schemas.microsoft.com/office/word/2023/wordml/word16du" xmlns:w16sdtdh="http://schemas.microsoft.com/office/word/2020/wordml/sdtdatahash" xmlns:w16sdtfl="http://schemas.microsoft.com/office/word/2024/wordml/sdtformatlock" xmlns:w16se="http://schemas.microsoft.com/office/word/2015/wordml/symex" xmlns:wpg="http://schemas.microsoft.com/office/word/2010/wordprocessingGroup" xmlns:wpi="http://schemas.microsoft.com/office/word/2010/wordprocessingInk" xmlns:wne="http://schemas.microsoft.com/office/word/2006/wordml" xmlns:wps="http://schemas.microsoft.com/office/word/2010/wordprocessingShape" mc:Ignorable="w14 w15 w16se w16cid w16 w16cex w16sdtdh w16sdtfl w16du wp14">
-  <w:p>
-    <w:pPr>
-      <w:pStyle w:val="a5"/>
-      <w:rPr>
-        <w:rFonts w:hint="eastAsia"/>
-      </w:rPr>
-    </w:pPr>
-  </w:p>
-</w:hdr>
 </file>
 
 <file path=word/numbering.xml><?xml version="1.0" encoding="utf-8"?>

</xml_diff>